<commit_message>
update paper figures and add clustering analysis for naim
</commit_message>
<xml_diff>
--- a/paper/paper_edits.docx
+++ b/paper/paper_edits.docx
@@ -12,26 +12,26 @@
     </w:p>
     <w:p>
       <w:pPr>
-        <w:pStyle w:val="AbstractTitle"/>
-      </w:pPr>
-      <w:r>
-        <w:t xml:space="preserve">Abstract</w:t>
+        <w:pStyle w:val="FirstParagraph"/>
+      </w:pPr>
+      <w:r>
+        <w:t xml:space="preserve">Molecular subtyping has become a cornerstone of precision oncology, enabling the stratification of cancer patients based on distinct gene expression patterns [Kandoth et al., 2013; Hoadley et al., 2018]. This stratification informs prognosis, guides therapeutic decisions, and enhances our understanding of tumor biology.</w:t>
       </w:r>
     </w:p>
     <w:p>
       <w:pPr>
-        <w:pStyle w:val="Abstract"/>
-      </w:pPr>
-      <w:r>
-        <w:t xml:space="preserve">Please provide an abstract of no more than 250 words.</w:t>
+        <w:pStyle w:val="BodyText"/>
+      </w:pPr>
+      <w:r>
+        <w:t xml:space="preserve">Nonnegative matrix factorization (NMF), first introduced by Lee and Seung for image decomposition [Lee &amp; Seung, 1999], has become a widely used technique for dimensionality reduction and feature learning. Unlike other matrix factorization approaches, the nonnegativity constraint in NMF yields an additive, parts-based representation that facilitates interpretability of latent factors. These properties have motivated extensive methodological development, leading to extensions that incorporate domain knowledge, structural constraints, or supervision. Examples include sparsity-regularized formulations [Hoyer, 2004], graph-regularized NMF [Cai et al., 2008], and more recent supervised formulations such as NMFProfiler for multi-omics integration and clinical stratification [Mercadié et al., 2025], as well as Bayesian multi-study NMF frameworks for mutational signatures [Grabski et al., 2025]. Collectively, these frameworks highlight the flexibility of NMF as a foundation for problem-specific decompositions.</w:t>
       </w:r>
     </w:p>
     <w:p>
       <w:pPr>
-        <w:pStyle w:val="FirstParagraph"/>
-      </w:pPr>
-      <w:r>
-        <w:t xml:space="preserve">Molecular subtyping has become a cornerstone of precision oncology, enabling the stratification of cancer patients based on distinct gene expression patterns. This stratification informs prognosis, guides therapeutic decisions, and enhances our understanding of tumor biology. However, despite considerable progress, current approaches often depend on unsupervised learning techniques, which may not reliably capture the prognostic relevance of specific cell-type contributions. As a result, many proposed gene expression signatures are evaluated retrospectively for clinical relevance and may lack consistent replication across independent cohorts and cancer types.</w:t>
+        <w:pStyle w:val="BodyText"/>
+      </w:pPr>
+      <w:r>
+        <w:t xml:space="preserve">High-throughput cancer transcriptomic datasets pose unique challenges for matrix factorization: they are high-dimensional, reflect mixtures of tumor and stromal populations, and are increasingly paired with censored survival outcomes. Standard applications of NMF in this domain typically follow a two-stage procedure—first identifying latent factors in an unsupervised manner, then testing their association with overall survival [Brunet et al., 2004; Bailey et al., 2016]. This retrospective strategy can uncover biologically meaningful patterns, but it does not optimize the decomposition with respect to patient outcomes, often yielding factors dominated by non-prognostic variation such as tumor purity, stromal admixture, or batch effects [Aran et al., 2017; Thorsson et al., 2018]. Although supervised and discriminant variants of NMF have been explored [Tran et al., 2024], and some recent works have coupled factorization with survival analysis (e.g., Learning Individual Survival Models from PanCancer Whole Transcriptomes [Kumar et al., 2023]; CoxNTF [Fogel et al., 2025]), these approaches either treat survival as a downstream predictor or rely on tensor factorizations not tailored to high-dimensional gene expression data.</w:t>
       </w:r>
     </w:p>
     <w:p>
@@ -39,33 +39,264 @@
         <w:pStyle w:val="BodyText"/>
       </w:pPr>
       <w:r>
-        <w:t xml:space="preserve">A key limitation lies in the disconnect between molecular subtyping and clinical outcomes. Most methods do not explicitly incorporate survival information during signature discovery, potentially overlooking gene programs with true prognostic value. Moreover, the complex interplay between malignant, stromal, and immune compartments in the tumor microenvironment presents an additional challenge to disentangling biologically meaningful and clinically actionable signals.</w:t>
+        <w:t xml:space="preserve">To address this gap, we introduce deSurv, a survival-driven deconvolution framework that integrates NMF with the Cox proportional hazards model [Cox, 1972]. deSurv directly incorporates survival information during factorization, producing interpretable, prognostic components while providing principled model selection criteria and regularization for high-dimensional stability [Tibshirani, 1997]. Implemented in a scalable pipeline for large cohorts, deSurv improves survival prediction relative to conventional unsupervised NMF while retaining interpretability. These results establish deSurv as a general framework for outcome-driven molecular subtyping across cancer types.</w:t>
+      </w:r>
+    </w:p>
+    <w:bookmarkStart w:id="31" w:name="results"/>
+    <w:p>
+      <w:pPr>
+        <w:pStyle w:val="Heading1"/>
+      </w:pPr>
+      <w:r>
+        <w:t xml:space="preserve">Results</w:t>
       </w:r>
     </w:p>
     <w:p>
       <w:pPr>
-        <w:pStyle w:val="BodyText"/>
-      </w:pPr>
-      <w:r>
-        <w:t xml:space="preserve">To address these issues, we developed deSurv, a Survival-driven Deconvolution framework that integrates bulk RNA-sequencing data with patient survival outcomes to uncover cell-type-enriched gene signatures with prognostic relevance. By aligning molecular signals with clinical endpoints, deSurv provides a more targeted and interpretable approach to gene signature discovery. Applying this method to diverse cancer cohorts, we identify novel prognostic markers within tumor, stromal, and immune compartments, offering new insights into the cellular basis of patient outcomes and revealing candidates for biomarker development or therapeutic intervention.</w:t>
+        <w:pStyle w:val="SourceCode"/>
+      </w:pPr>
+      <w:r>
+        <w:rPr>
+          <w:rStyle w:val="FunctionTok"/>
+        </w:rPr>
+        <w:t xml:space="preserve">library</w:t>
+      </w:r>
+      <w:r>
+        <w:rPr>
+          <w:rStyle w:val="NormalTok"/>
+        </w:rPr>
+        <w:t xml:space="preserve">(targets)</w:t>
+      </w:r>
+      <w:r>
+        <w:br/>
+      </w:r>
+      <w:r>
+        <w:rPr>
+          <w:rStyle w:val="FunctionTok"/>
+        </w:rPr>
+        <w:t xml:space="preserve">library</w:t>
+      </w:r>
+      <w:r>
+        <w:rPr>
+          <w:rStyle w:val="NormalTok"/>
+        </w:rPr>
+        <w:t xml:space="preserve">(dplyr)</w:t>
+      </w:r>
+      <w:r>
+        <w:br/>
+      </w:r>
+      <w:r>
+        <w:rPr>
+          <w:rStyle w:val="FunctionTok"/>
+        </w:rPr>
+        <w:t xml:space="preserve">library</w:t>
+      </w:r>
+      <w:r>
+        <w:rPr>
+          <w:rStyle w:val="NormalTok"/>
+        </w:rPr>
+        <w:t xml:space="preserve">(ggplot2)</w:t>
+      </w:r>
+      <w:r>
+        <w:br/>
+      </w:r>
+      <w:r>
+        <w:rPr>
+          <w:rStyle w:val="NormalTok"/>
+        </w:rPr>
+        <w:t xml:space="preserve">PKG_VERSION        </w:t>
+      </w:r>
+      <w:r>
+        <w:rPr>
+          <w:rStyle w:val="OtherTok"/>
+        </w:rPr>
+        <w:t xml:space="preserve">=</w:t>
+      </w:r>
+      <w:r>
+        <w:rPr>
+          <w:rStyle w:val="NormalTok"/>
+        </w:rPr>
+        <w:t xml:space="preserve"> utils</w:t>
+      </w:r>
+      <w:r>
+        <w:rPr>
+          <w:rStyle w:val="SpecialCharTok"/>
+        </w:rPr>
+        <w:t xml:space="preserve">::</w:t>
+      </w:r>
+      <w:r>
+        <w:rPr>
+          <w:rStyle w:val="FunctionTok"/>
+        </w:rPr>
+        <w:t xml:space="preserve">packageDescription</w:t>
+      </w:r>
+      <w:r>
+        <w:rPr>
+          <w:rStyle w:val="NormalTok"/>
+        </w:rPr>
+        <w:t xml:space="preserve">(</w:t>
+      </w:r>
+      <w:r>
+        <w:rPr>
+          <w:rStyle w:val="StringTok"/>
+        </w:rPr>
+        <w:t xml:space="preserve">"coxNMF"</w:t>
+      </w:r>
+      <w:r>
+        <w:rPr>
+          <w:rStyle w:val="NormalTok"/>
+        </w:rPr>
+        <w:t xml:space="preserve">, </w:t>
+      </w:r>
+      <w:r>
+        <w:rPr>
+          <w:rStyle w:val="AttributeTok"/>
+        </w:rPr>
+        <w:t xml:space="preserve">fields =</w:t>
+      </w:r>
+      <w:r>
+        <w:rPr>
+          <w:rStyle w:val="NormalTok"/>
+        </w:rPr>
+        <w:t xml:space="preserve"> </w:t>
+      </w:r>
+      <w:r>
+        <w:rPr>
+          <w:rStyle w:val="StringTok"/>
+        </w:rPr>
+        <w:t xml:space="preserve">"RemoteRef"</w:t>
+      </w:r>
+      <w:r>
+        <w:rPr>
+          <w:rStyle w:val="NormalTok"/>
+        </w:rPr>
+        <w:t xml:space="preserve">)</w:t>
+      </w:r>
+      <w:r>
+        <w:br/>
+      </w:r>
+      <w:r>
+        <w:rPr>
+          <w:rStyle w:val="NormalTok"/>
+        </w:rPr>
+        <w:t xml:space="preserve">GIT_BRANCH         </w:t>
+      </w:r>
+      <w:r>
+        <w:rPr>
+          <w:rStyle w:val="OtherTok"/>
+        </w:rPr>
+        <w:t xml:space="preserve">=</w:t>
+      </w:r>
+      <w:r>
+        <w:rPr>
+          <w:rStyle w:val="NormalTok"/>
+        </w:rPr>
+        <w:t xml:space="preserve"> gert</w:t>
+      </w:r>
+      <w:r>
+        <w:rPr>
+          <w:rStyle w:val="SpecialCharTok"/>
+        </w:rPr>
+        <w:t xml:space="preserve">::</w:t>
+      </w:r>
+      <w:r>
+        <w:rPr>
+          <w:rStyle w:val="FunctionTok"/>
+        </w:rPr>
+        <w:t xml:space="preserve">git_branch</w:t>
+      </w:r>
+      <w:r>
+        <w:rPr>
+          <w:rStyle w:val="NormalTok"/>
+        </w:rPr>
+        <w:t xml:space="preserve">()</w:t>
+      </w:r>
+      <w:r>
+        <w:br/>
+      </w:r>
+      <w:r>
+        <w:rPr>
+          <w:rStyle w:val="NormalTok"/>
+        </w:rPr>
+        <w:t xml:space="preserve">store</w:t>
+      </w:r>
+      <w:r>
+        <w:rPr>
+          <w:rStyle w:val="OtherTok"/>
+        </w:rPr>
+        <w:t xml:space="preserve">=</w:t>
+      </w:r>
+      <w:r>
+        <w:rPr>
+          <w:rStyle w:val="FunctionTok"/>
+        </w:rPr>
+        <w:t xml:space="preserve">paste0</w:t>
+      </w:r>
+      <w:r>
+        <w:rPr>
+          <w:rStyle w:val="NormalTok"/>
+        </w:rPr>
+        <w:t xml:space="preserve">(</w:t>
+      </w:r>
+      <w:r>
+        <w:rPr>
+          <w:rStyle w:val="StringTok"/>
+        </w:rPr>
+        <w:t xml:space="preserve">"store_PKG_VERSION="</w:t>
+      </w:r>
+      <w:r>
+        <w:rPr>
+          <w:rStyle w:val="NormalTok"/>
+        </w:rPr>
+        <w:t xml:space="preserve">,PKG_VERSION,</w:t>
+      </w:r>
+      <w:r>
+        <w:rPr>
+          <w:rStyle w:val="StringTok"/>
+        </w:rPr>
+        <w:t xml:space="preserve">"_GIT_BRANCH="</w:t>
+      </w:r>
+      <w:r>
+        <w:rPr>
+          <w:rStyle w:val="NormalTok"/>
+        </w:rPr>
+        <w:t xml:space="preserve">,GIT_BRANCH)</w:t>
+      </w:r>
+      <w:r>
+        <w:br/>
+      </w:r>
+      <w:r>
+        <w:rPr>
+          <w:rStyle w:val="FunctionTok"/>
+        </w:rPr>
+        <w:t xml:space="preserve">tar_config_set</w:t>
+      </w:r>
+      <w:r>
+        <w:rPr>
+          <w:rStyle w:val="NormalTok"/>
+        </w:rPr>
+        <w:t xml:space="preserve">(</w:t>
+      </w:r>
+      <w:r>
+        <w:rPr>
+          <w:rStyle w:val="AttributeTok"/>
+        </w:rPr>
+        <w:t xml:space="preserve">store=</w:t>
+      </w:r>
+      <w:r>
+        <w:rPr>
+          <w:rStyle w:val="NormalTok"/>
+        </w:rPr>
+        <w:t xml:space="preserve">store)</w:t>
       </w:r>
     </w:p>
-    <w:bookmarkStart w:id="25" w:name="results"/>
+    <w:bookmarkStart w:id="23" w:name="Xd1343820877763e22a70d74a67319e0e2174f7d"/>
     <w:p>
       <w:pPr>
-        <w:pStyle w:val="Heading1"/>
-      </w:pPr>
-      <w:r>
-        <w:t xml:space="preserve">Results</w:t>
-      </w:r>
-    </w:p>
-    <w:bookmarkStart w:id="20" w:name="X243697d2f525dac17a01d1632b4615239b7f7fb"/>
-    <w:p>
-      <w:pPr>
         <w:pStyle w:val="Heading2"/>
       </w:pPr>
       <w:r>
-        <w:t xml:space="preserve">DeSurv incorporates patient survival information directly into deconvolution</w:t>
+        <w:t xml:space="preserve">The NMF–Cox framework provides an end-to-end workflow for prognostic modeling</w:t>
       </w:r>
     </w:p>
     <w:p>
@@ -73,216 +304,169 @@
         <w:pStyle w:val="FirstParagraph"/>
       </w:pPr>
       <w:r>
-        <w:t xml:space="preserve">We developed deSurv, a survival-driven deconvolution framework that integrates bulk RNA-sequencing data with patient outcome information to identify cell-type-enriched gene signatures with prognostic value.</w:t>
-      </w:r>
-      <w:r>
-        <w:t xml:space="preserve"> </w:t>
-      </w:r>
-      <w:r>
-        <w:t xml:space="preserve">Unlike standard unsupervised methods that cluster expression patterns without regard to patient survival, deSurv incorporates time-to-event data directly into the signature discovery process. We applied deSurv to bulk RNA-seq profiles from pancreatic, bladder, and colorectal cancer cohorts, each with matched clinical follow-up data, encompassing a total of n = XXXX patients across discovery and validation sets (Table 1).</w:t>
-      </w:r>
-      <w:r>
-        <w:t xml:space="preserve"> </w:t>
-      </w:r>
-      <w:r>
-        <w:t xml:space="preserve">The pipeline …</w:t>
-      </w:r>
-    </w:p>
-    <w:bookmarkEnd w:id="20"/>
-    <w:bookmarkStart w:id="21" w:name="X52f40a7c7737d1d57e6888c956389809a8c68a3"/>
-    <w:p>
-      <w:pPr>
-        <w:pStyle w:val="Heading2"/>
-      </w:pPr>
-      <w:r>
-        <w:t xml:space="preserve">DeSurv captures distinct cell-type specific gene signatures</w:t>
+        <w:t xml:space="preserve">We developed an integrated framework that combines nonnegative matrix factorization (NMF) with Cox proportional hazards regression to identify latent gene expression factors associated with survival. As illustrated in Figure 1, the workflow begins with preprocessing and normalization of RNA-seq data, followed by NMF decomposition into patient factor loadings (</w:t>
+      </w:r>
+      <m:oMath>
+        <m:r>
+          <m:t>W</m:t>
+        </m:r>
+      </m:oMath>
+      <w:r>
+        <w:t xml:space="preserve">) and gene weightings (</w:t>
+      </w:r>
+      <m:oMath>
+        <m:r>
+          <m:t>H</m:t>
+        </m:r>
+      </m:oMath>
+      <w:r>
+        <w:t xml:space="preserve">). A Cox model is then fit using projected covariates derived from W. The framework incorporates a balancing parameter</w:t>
+      </w:r>
+      <w:r>
+        <w:t xml:space="preserve"> </w:t>
+      </w:r>
+      <m:oMath>
+        <m:r>
+          <m:t>α</m:t>
+        </m:r>
+      </m:oMath>
+      <w:r>
+        <w:t xml:space="preserve"> </w:t>
+      </w:r>
+      <w:r>
+        <w:t xml:space="preserve">to control the relative influence of reconstruction error versus survival likelihood. Model selection is performed via cross-validation across k, penalty parameters, and</w:t>
+      </w:r>
+      <w:r>
+        <w:t xml:space="preserve"> </w:t>
+      </w:r>
+      <m:oMath>
+        <m:r>
+          <m:t>α</m:t>
+        </m:r>
+      </m:oMath>
+      <w:r>
+        <w:t xml:space="preserve">, with downstream evaluation focusing on both predictive performance and biological interpretability.</w:t>
       </w:r>
     </w:p>
     <w:p>
       <w:pPr>
-        <w:pStyle w:val="FirstParagraph"/>
-      </w:pPr>
-      <w:r>
-        <w:t xml:space="preserve">In PDAC, deSurv identified cell-type-specific signatures spanning tumor, stromal, and immune compartments. Many signatures were distinct from those obtained using unsupervised methods (Figure 2a and 2b). Representative heatmaps illustrate the differential expression of these signatures across patients (Figure 2c).</w:t>
-      </w:r>
-    </w:p>
-    <w:bookmarkEnd w:id="21"/>
-    <w:bookmarkStart w:id="22" w:name="X527d9b5f7c3f7128bcda89e59e75e83ecb1db04"/>
-    <w:p>
-      <w:pPr>
-        <w:pStyle w:val="Heading2"/>
-      </w:pPr>
-      <w:r>
-        <w:t xml:space="preserve">DeSurv extracts prognostic tumor signatures</w:t>
+        <w:pStyle w:val="SourceCode"/>
+      </w:pPr>
+      <w:r>
+        <w:rPr>
+          <w:rStyle w:val="NormalTok"/>
+        </w:rPr>
+        <w:t xml:space="preserve">knitr</w:t>
+      </w:r>
+      <w:r>
+        <w:rPr>
+          <w:rStyle w:val="SpecialCharTok"/>
+        </w:rPr>
+        <w:t xml:space="preserve">::</w:t>
+      </w:r>
+      <w:r>
+        <w:rPr>
+          <w:rStyle w:val="FunctionTok"/>
+        </w:rPr>
+        <w:t xml:space="preserve">include_graphics</w:t>
+      </w:r>
+      <w:r>
+        <w:rPr>
+          <w:rStyle w:val="NormalTok"/>
+        </w:rPr>
+        <w:t xml:space="preserve">(</w:t>
+      </w:r>
+      <w:r>
+        <w:rPr>
+          <w:rStyle w:val="StringTok"/>
+        </w:rPr>
+        <w:t xml:space="preserve">"../figures/model_schematic_with_validation.pdf"</w:t>
+      </w:r>
+      <w:r>
+        <w:rPr>
+          <w:rStyle w:val="NormalTok"/>
+        </w:rPr>
+        <w:t xml:space="preserve">)</w:t>
       </w:r>
     </w:p>
     <w:p>
       <w:pPr>
-        <w:pStyle w:val="FirstParagraph"/>
-      </w:pPr>
-      <w:r>
-        <w:t xml:space="preserve">Tumor signatures derived using deSurv stratified patients into groups with significantly different survival outcomes (log-rank P &lt; 0.001 in all datasets), often outperforming unsupervised methods (Figures 3a-c). For example, a deSurv tumor signature achieved a concordance index (C-index) of 0.72 compared to 0.61 for the nearest unsupervised equivalent (Table 1).</w:t>
-      </w:r>
-      <w:r>
-        <w:t xml:space="preserve"> </w:t>
-      </w:r>
-      <w:r>
-        <w:t xml:space="preserve">Performance gains were consistent in independent validation cohorts (Figures 3d-e) , indicating that survival integration during signature discovery enhances prognostic robustness.</w:t>
-      </w:r>
-    </w:p>
-    <w:bookmarkEnd w:id="22"/>
-    <w:bookmarkStart w:id="23" w:name="Xf3cc0390ef71a515b88c6ffccd90ab7d6850e4e"/>
-    <w:p>
-      <w:pPr>
-        <w:pStyle w:val="Heading2"/>
-      </w:pPr>
-      <w:r>
-        <w:t xml:space="preserve">DeSurv extracts prognostic stromal factors</w:t>
+        <w:pStyle w:val="CaptionedFigure"/>
+      </w:pPr>
+      <w:r>
+        <w:drawing>
+          <wp:inline>
+            <wp:extent cx="4267200" cy="2133600"/>
+            <wp:effectExtent b="0" l="0" r="0" t="0"/>
+            <wp:docPr descr="DeSurv overview" title="" id="21" name="Picture"/>
+            <a:graphic>
+              <a:graphicData uri="http://schemas.openxmlformats.org/drawingml/2006/picture">
+                <pic:pic>
+                  <pic:nvPicPr>
+                    <pic:cNvPr descr="../figures/model_schematic_with_validation.pdf" id="22" name="Picture"/>
+                    <pic:cNvPicPr>
+                      <a:picLocks noChangeArrowheads="1" noChangeAspect="1"/>
+                    </pic:cNvPicPr>
+                  </pic:nvPicPr>
+                  <pic:blipFill>
+                    <a:blip r:embed="rId20"/>
+                    <a:stretch>
+                      <a:fillRect/>
+                    </a:stretch>
+                  </pic:blipFill>
+                  <pic:spPr bwMode="auto">
+                    <a:xfrm>
+                      <a:off x="0" y="0"/>
+                      <a:ext cx="4267200" cy="2133600"/>
+                    </a:xfrm>
+                    <a:prstGeom prst="rect">
+                      <a:avLst/>
+                    </a:prstGeom>
+                    <a:noFill/>
+                    <a:ln w="9525">
+                      <a:noFill/>
+                      <a:headEnd/>
+                      <a:tailEnd/>
+                    </a:ln>
+                  </pic:spPr>
+                </pic:pic>
+              </a:graphicData>
+            </a:graphic>
+          </wp:inline>
+        </w:drawing>
       </w:r>
     </w:p>
     <w:p>
       <w:pPr>
-        <w:pStyle w:val="FirstParagraph"/>
-      </w:pPr>
-      <w:r>
-        <w:t xml:space="preserve">Figure: Panel A , Panel B, Panel C,</w:t>
+        <w:pStyle w:val="ImageCaption"/>
+      </w:pPr>
+      <w:r>
+        <w:t xml:space="preserve">DeSurv overview</w:t>
+      </w:r>
+    </w:p>
+    <w:bookmarkEnd w:id="23"/>
+    <w:bookmarkStart w:id="24" w:name="Xe6a328bca84923f8130656241372315dfc61b80"/>
+    <w:p>
+      <w:pPr>
+        <w:pStyle w:val="Heading2"/>
+      </w:pPr>
+      <w:r>
+        <w:t xml:space="preserve">The NMF–Cox model shows consistent convergence and stability across restarts</w:t>
       </w:r>
     </w:p>
     <w:p>
       <w:pPr>
-        <w:pStyle w:val="BodyText"/>
-      </w:pPr>
-      <w:r>
-        <w:t xml:space="preserve">At k=9, DeSurv finds an iCAF factor that is not found in standard NMF. When we cluster on this factor in the validation datasets the resulting clusters are prognostic for patient survival. Note that almost all other stromal factors are not associated with survival.</w:t>
-      </w:r>
-    </w:p>
-    <w:bookmarkEnd w:id="23"/>
-    <w:bookmarkStart w:id="24" w:name="X2a564d914f709b6c33105efd6805a5212e1e799"/>
-    <w:p>
-      <w:pPr>
-        <w:pStyle w:val="Heading2"/>
-      </w:pPr>
-      <w:r>
-        <w:t xml:space="preserve">Cross-cancer robustness of prognostic signatures</w:t>
-      </w:r>
-    </w:p>
-    <w:p>
-      <w:pPr>
         <w:pStyle w:val="FirstParagraph"/>
       </w:pPr>
       <w:r>
-        <w:t xml:space="preserve">Several deSurv-derived signatures retained prognostic value when applied to other cancer types. A tumor signature discovered in PDAC was also prognostic in colorectal cancer (log-rank P = xx), and a stromal signature from pancreatic cancer predicted improved survival in bladder cancer (Figure 4a).</w:t>
-      </w:r>
-      <w:r>
-        <w:t xml:space="preserve"> </w:t>
-      </w:r>
-      <w:r>
-        <w:t xml:space="preserve">Heatmaps of hazard ratios across cross-cancer applications revealed that X% of signatures demonstrated statistically significant associations in at least two cancer types (Figure 4b), suggesting a degree of pan-cancer prognostic relevance.</w:t>
-      </w:r>
-    </w:p>
-    <w:bookmarkEnd w:id="24"/>
-    <w:bookmarkEnd w:id="25"/>
-    <w:bookmarkStart w:id="35" w:name="materials-and-methods"/>
-    <w:p>
-      <w:pPr>
-        <w:pStyle w:val="Heading1"/>
-      </w:pPr>
-      <w:r>
-        <w:t xml:space="preserve">Materials and methods</w:t>
-      </w:r>
-    </w:p>
-    <w:bookmarkStart w:id="26" w:name="standard-nmf"/>
-    <w:p>
-      <w:pPr>
-        <w:pStyle w:val="Heading2"/>
-      </w:pPr>
-      <w:r>
-        <w:t xml:space="preserve">Standard NMF</w:t>
-      </w:r>
-    </w:p>
-    <w:p>
-      <w:pPr>
-        <w:pStyle w:val="FirstParagraph"/>
-      </w:pPr>
-      <w:r>
-        <w:t xml:space="preserve">Let</w:t>
+        <w:t xml:space="preserve">Across datasets and initialization schemes, the NMF–Cox algorithm consistently converged to numerically stable solutions within the designated iteration budget. Warm-start strategies, in which solutions at</w:t>
       </w:r>
       <w:r>
         <w:t xml:space="preserve"> </w:t>
       </w:r>
       <m:oMath>
         <m:r>
-          <m:t>X</m:t>
-        </m:r>
-      </m:oMath>
-      <w:r>
-        <w:t xml:space="preserve"> </w:t>
-      </w:r>
-      <w:r>
-        <w:t xml:space="preserve">be a bulk gene expression matrix of</w:t>
-      </w:r>
-      <w:r>
-        <w:t xml:space="preserve"> </w:t>
-      </w:r>
-      <m:oMath>
-        <m:r>
-          <m:t>p</m:t>
-        </m:r>
-      </m:oMath>
-      <w:r>
-        <w:t xml:space="preserve"> </w:t>
-      </w:r>
-      <w:r>
-        <w:t xml:space="preserve">genes by</w:t>
-      </w:r>
-      <w:r>
-        <w:t xml:space="preserve"> </w:t>
-      </w:r>
-      <m:oMath>
-        <m:r>
-          <m:t>n</m:t>
-        </m:r>
-      </m:oMath>
-      <w:r>
-        <w:t xml:space="preserve"> </w:t>
-      </w:r>
-      <w:r>
-        <w:t xml:space="preserve">subjects. Standard NMF seeks to reconstruct X using two nonnegative matrices</w:t>
-      </w:r>
-      <w:r>
-        <w:t xml:space="preserve"> </w:t>
-      </w:r>
-      <m:oMath>
-        <m:r>
-          <m:t>W</m:t>
-        </m:r>
-      </m:oMath>
-      <w:r>
-        <w:t xml:space="preserve"> </w:t>
-      </w:r>
-      <w:r>
-        <w:t xml:space="preserve">and</w:t>
-      </w:r>
-      <w:r>
-        <w:t xml:space="preserve"> </w:t>
-      </w:r>
-      <m:oMath>
-        <m:r>
-          <m:t>H</m:t>
-        </m:r>
-      </m:oMath>
-      <w:r>
-        <w:t xml:space="preserve"> </w:t>
-      </w:r>
-      <w:r>
-        <w:t xml:space="preserve">such that</w:t>
-      </w:r>
-      <w:r>
-        <w:t xml:space="preserve"> </w:t>
-      </w:r>
-      <m:oMath>
-        <m:r>
-          <m:t>X</m:t>
+          <m:t>α</m:t>
         </m:r>
         <m:r>
           <m:rPr>
@@ -291,160 +475,2489 @@
           <m:t>=</m:t>
         </m:r>
         <m:r>
-          <m:t>W</m:t>
-        </m:r>
-        <m:r>
-          <m:t>H</m:t>
+          <m:t>0</m:t>
         </m:r>
       </m:oMath>
       <w:r>
-        <w:t xml:space="preserve">, where</w:t>
+        <w:t xml:space="preserve"> </w:t>
+      </w:r>
+      <w:r>
+        <w:t xml:space="preserve">initialized supervised runs, substantially reduced variability across restarts and improved reproducibility. Figure 2 shows representative loss trajectories demonstrating monotone decreases until convergence, while Figure 3 summarizes performance variability across restarts. Compared with naïve random initialization, warm-starts produced tighter distributions of cross-validated C-index and partial likelihood, confirming stability of the optimization procedure.</w:t>
+      </w:r>
+    </w:p>
+    <w:bookmarkEnd w:id="24"/>
+    <w:bookmarkStart w:id="28" w:name="X52371e22c2242beb9108f8f60f370d592d13d3c"/>
+    <w:p>
+      <w:pPr>
+        <w:pStyle w:val="Heading2"/>
+      </w:pPr>
+      <w:r>
+        <w:t xml:space="preserve">Cross-validation of NMF–Cox identifies parameter settings that balance prediction and reconstruction</w:t>
+      </w:r>
+    </w:p>
+    <w:p>
+      <w:pPr>
+        <w:pStyle w:val="FirstParagraph"/>
+      </w:pPr>
+      <w:r>
+        <w:t xml:space="preserve">We evaluated performance across a grid of factor ranks (k), penalties, and values of</w:t>
       </w:r>
       <w:r>
         <w:t xml:space="preserve"> </w:t>
       </w:r>
       <m:oMath>
         <m:r>
-          <m:t>W</m:t>
+          <m:t>α</m:t>
         </m:r>
       </m:oMath>
       <w:r>
-        <w:t xml:space="preserve"> </w:t>
-      </w:r>
-      <w:r>
-        <w:t xml:space="preserve">is a</w:t>
+        <w:t xml:space="preserve">. Cross-validated C-index varied modestly across conditions, with no consistent improvement for</w:t>
       </w:r>
       <w:r>
         <w:t xml:space="preserve"> </w:t>
       </w:r>
       <m:oMath>
         <m:r>
-          <m:t>p</m:t>
+          <m:t>α</m:t>
         </m:r>
         <m:r>
           <m:rPr>
             <m:sty m:val="p"/>
           </m:rPr>
-          <m:t>×</m:t>
-        </m:r>
-        <m:r>
-          <m:t>k</m:t>
+          <m:t>&gt;</m:t>
+        </m:r>
+        <m:r>
+          <m:t>0</m:t>
         </m:r>
       </m:oMath>
       <w:r>
-        <w:t xml:space="preserve"> </w:t>
-      </w:r>
-      <w:r>
-        <w:t xml:space="preserve">matrix of gene weights and</w:t>
+        <w:t xml:space="preserve">. Instead, supervised extensions altered the orientation of latent factors while maintaining comparable discrimination. Figure @ref(fig::fig-cv)A shows a heatmap of mean C-index across k and</w:t>
       </w:r>
       <w:r>
         <w:t xml:space="preserve"> </w:t>
       </w:r>
       <m:oMath>
         <m:r>
-          <m:t>H</m:t>
+          <m:t>α</m:t>
         </m:r>
       </m:oMath>
       <w:r>
-        <w:t xml:space="preserve"> </w:t>
-      </w:r>
-      <w:r>
-        <w:t xml:space="preserve">is a</w:t>
+        <w:t xml:space="preserve">, and @ref(fig::fig-cv)B illustrates C-index trends across</w:t>
       </w:r>
       <w:r>
         <w:t xml:space="preserve"> </w:t>
       </w:r>
       <m:oMath>
         <m:r>
-          <m:t>k</m:t>
-        </m:r>
-        <m:r>
-          <m:rPr>
-            <m:sty m:val="p"/>
-          </m:rPr>
-          <m:t>×</m:t>
-        </m:r>
-        <m:r>
-          <m:t>n</m:t>
+          <m:t>α</m:t>
         </m:r>
       </m:oMath>
       <w:r>
         <w:t xml:space="preserve"> </w:t>
       </w:r>
       <w:r>
-        <w:t xml:space="preserve">matrix of sample weights. This is done by minimizing the loss function</w:t>
+        <w:t xml:space="preserve">stratified by rank.</w:t>
       </w:r>
     </w:p>
     <w:p>
       <w:pPr>
-        <w:pStyle w:val="BodyText"/>
-      </w:pPr>
+        <w:pStyle w:val="SourceCode"/>
+      </w:pPr>
+      <w:r>
+        <w:rPr>
+          <w:rStyle w:val="FunctionTok"/>
+        </w:rPr>
+        <w:t xml:space="preserve">tar_load_globals</w:t>
+      </w:r>
+      <w:r>
+        <w:rPr>
+          <w:rStyle w:val="NormalTok"/>
+        </w:rPr>
+        <w:t xml:space="preserve">()</w:t>
+      </w:r>
+      <w:r>
+        <w:br/>
+      </w:r>
+      <w:r>
+        <w:rPr>
+          <w:rStyle w:val="FunctionTok"/>
+        </w:rPr>
+        <w:t xml:space="preserve">tar_load</w:t>
+      </w:r>
+      <w:r>
+        <w:rPr>
+          <w:rStyle w:val="NormalTok"/>
+        </w:rPr>
+        <w:t xml:space="preserve">(cv_metrics)</w:t>
+      </w:r>
+      <w:r>
+        <w:br/>
+      </w:r>
+      <w:r>
+        <w:rPr>
+          <w:rStyle w:val="NormalTok"/>
+        </w:rPr>
+        <w:t xml:space="preserve">mets_test</w:t>
+      </w:r>
+      <w:r>
+        <w:rPr>
+          <w:rStyle w:val="OtherTok"/>
+        </w:rPr>
+        <w:t xml:space="preserve">=</w:t>
+      </w:r>
+      <w:r>
+        <w:rPr>
+          <w:rStyle w:val="NormalTok"/>
+        </w:rPr>
+        <w:t xml:space="preserve">cv_metrics</w:t>
+      </w:r>
+      <w:r>
+        <w:rPr>
+          <w:rStyle w:val="SpecialCharTok"/>
+        </w:rPr>
+        <w:t xml:space="preserve">$</w:t>
+      </w:r>
+      <w:r>
+        <w:rPr>
+          <w:rStyle w:val="NormalTok"/>
+        </w:rPr>
+        <w:t xml:space="preserve">mets_test</w:t>
+      </w:r>
+      <w:r>
+        <w:br/>
+      </w:r>
+      <w:r>
+        <w:rPr>
+          <w:rStyle w:val="NormalTok"/>
+        </w:rPr>
+        <w:t xml:space="preserve">avg_init </w:t>
+      </w:r>
+      <w:r>
+        <w:rPr>
+          <w:rStyle w:val="OtherTok"/>
+        </w:rPr>
+        <w:t xml:space="preserve">=</w:t>
+      </w:r>
+      <w:r>
+        <w:rPr>
+          <w:rStyle w:val="NormalTok"/>
+        </w:rPr>
+        <w:t xml:space="preserve"> mets_test </w:t>
+      </w:r>
+      <w:r>
+        <w:rPr>
+          <w:rStyle w:val="SpecialCharTok"/>
+        </w:rPr>
+        <w:t xml:space="preserve">%&gt;%</w:t>
+      </w:r>
+      <w:r>
+        <w:rPr>
+          <w:rStyle w:val="NormalTok"/>
+        </w:rPr>
+        <w:t xml:space="preserve"> </w:t>
+      </w:r>
+      <w:r>
+        <w:rPr>
+          <w:rStyle w:val="FunctionTok"/>
+        </w:rPr>
+        <w:t xml:space="preserve">group_by</w:t>
+      </w:r>
+      <w:r>
+        <w:rPr>
+          <w:rStyle w:val="NormalTok"/>
+        </w:rPr>
+        <w:t xml:space="preserve">(k,fold,alpha,lambda,eta,lambdaW) </w:t>
+      </w:r>
+      <w:r>
+        <w:rPr>
+          <w:rStyle w:val="SpecialCharTok"/>
+        </w:rPr>
+        <w:t xml:space="preserve">%&gt;%</w:t>
+      </w:r>
+      <w:r>
+        <w:br/>
+      </w:r>
+      <w:r>
+        <w:rPr>
+          <w:rStyle w:val="NormalTok"/>
+        </w:rPr>
+        <w:t xml:space="preserve">  </w:t>
+      </w:r>
+      <w:r>
+        <w:rPr>
+          <w:rStyle w:val="FunctionTok"/>
+        </w:rPr>
+        <w:t xml:space="preserve">summarize</w:t>
+      </w:r>
+      <w:r>
+        <w:rPr>
+          <w:rStyle w:val="NormalTok"/>
+        </w:rPr>
+        <w:t xml:space="preserve">(</w:t>
+      </w:r>
+      <w:r>
+        <w:rPr>
+          <w:rStyle w:val="AttributeTok"/>
+        </w:rPr>
+        <w:t xml:space="preserve">c_mean_f =</w:t>
+      </w:r>
+      <w:r>
+        <w:rPr>
+          <w:rStyle w:val="NormalTok"/>
+        </w:rPr>
+        <w:t xml:space="preserve"> </w:t>
+      </w:r>
+      <w:r>
+        <w:rPr>
+          <w:rStyle w:val="FunctionTok"/>
+        </w:rPr>
+        <w:t xml:space="preserve">mean</w:t>
+      </w:r>
+      <w:r>
+        <w:rPr>
+          <w:rStyle w:val="NormalTok"/>
+        </w:rPr>
+        <w:t xml:space="preserve">(c), </w:t>
+      </w:r>
+      <w:r>
+        <w:rPr>
+          <w:rStyle w:val="AttributeTok"/>
+        </w:rPr>
+        <w:t xml:space="preserve">pl_mean_f=</w:t>
+      </w:r>
+      <w:r>
+        <w:rPr>
+          <w:rStyle w:val="FunctionTok"/>
+        </w:rPr>
+        <w:t xml:space="preserve">mean</w:t>
+      </w:r>
+      <w:r>
+        <w:rPr>
+          <w:rStyle w:val="NormalTok"/>
+        </w:rPr>
+        <w:t xml:space="preserve">(sloss))</w:t>
+      </w:r>
+      <w:r>
+        <w:rPr>
+          <w:rStyle w:val="SpecialCharTok"/>
+        </w:rPr>
+        <w:t xml:space="preserve">%&gt;%</w:t>
+      </w:r>
+      <w:r>
+        <w:br/>
+      </w:r>
+      <w:r>
+        <w:rPr>
+          <w:rStyle w:val="NormalTok"/>
+        </w:rPr>
+        <w:t xml:space="preserve">  </w:t>
+      </w:r>
+      <w:r>
+        <w:rPr>
+          <w:rStyle w:val="FunctionTok"/>
+        </w:rPr>
+        <w:t xml:space="preserve">ungroup</w:t>
+      </w:r>
+      <w:r>
+        <w:rPr>
+          <w:rStyle w:val="NormalTok"/>
+        </w:rPr>
+        <w:t xml:space="preserve">()</w:t>
+      </w:r>
     </w:p>
     <w:p>
       <w:pPr>
-        <w:pStyle w:val="BodyText"/>
-      </w:pPr>
-      <w:r>
-        <w:t xml:space="preserve">where</w:t>
-      </w:r>
-      <w:r>
-        <w:t xml:space="preserve"> </w:t>
-      </w:r>
-      <m:oMath>
-        <m:r>
-          <m:t>F</m:t>
-        </m:r>
-      </m:oMath>
-      <w:r>
-        <w:t xml:space="preserve"> </w:t>
-      </w:r>
-      <w:r>
-        <w:t xml:space="preserve">represents the Frobenius norm.</w:t>
+        <w:pStyle w:val="SourceCode"/>
+      </w:pPr>
+      <w:r>
+        <w:rPr>
+          <w:rStyle w:val="VerbatimChar"/>
+        </w:rPr>
+        <w:t xml:space="preserve">## `summarise()` has grouped output by 'k', 'fold', 'alpha', 'lambda', 'eta'. You can override using</w:t>
+      </w:r>
+      <w:r>
+        <w:br/>
+      </w:r>
+      <w:r>
+        <w:rPr>
+          <w:rStyle w:val="VerbatimChar"/>
+        </w:rPr>
+        <w:t xml:space="preserve">## the `.groups` argument.</w:t>
       </w:r>
     </w:p>
     <w:p>
       <w:pPr>
-        <w:pStyle w:val="BodyText"/>
-      </w:pPr>
-      <w:r>
-        <w:t xml:space="preserve">Multiplicative updates were proposed by Lee and Seung with the following update rules</w:t>
-      </w:r>
-      <w:r>
-        <w:t xml:space="preserve"> </w:t>
-      </w:r>
-      <w:r>
-        <w:t xml:space="preserve">(1)</w:t>
-      </w:r>
-      <w:r>
-        <w:t xml:space="preserve">:</w:t>
+        <w:pStyle w:val="SourceCode"/>
+      </w:pPr>
+      <w:r>
+        <w:rPr>
+          <w:rStyle w:val="NormalTok"/>
+        </w:rPr>
+        <w:t xml:space="preserve">avg_fold </w:t>
+      </w:r>
+      <w:r>
+        <w:rPr>
+          <w:rStyle w:val="OtherTok"/>
+        </w:rPr>
+        <w:t xml:space="preserve">=</w:t>
+      </w:r>
+      <w:r>
+        <w:rPr>
+          <w:rStyle w:val="NormalTok"/>
+        </w:rPr>
+        <w:t xml:space="preserve"> avg_init </w:t>
+      </w:r>
+      <w:r>
+        <w:rPr>
+          <w:rStyle w:val="SpecialCharTok"/>
+        </w:rPr>
+        <w:t xml:space="preserve">%&gt;%</w:t>
+      </w:r>
+      <w:r>
+        <w:rPr>
+          <w:rStyle w:val="NormalTok"/>
+        </w:rPr>
+        <w:t xml:space="preserve"> </w:t>
+      </w:r>
+      <w:r>
+        <w:rPr>
+          <w:rStyle w:val="FunctionTok"/>
+        </w:rPr>
+        <w:t xml:space="preserve">group_by</w:t>
+      </w:r>
+      <w:r>
+        <w:rPr>
+          <w:rStyle w:val="NormalTok"/>
+        </w:rPr>
+        <w:t xml:space="preserve">(k,alpha,lambda,eta,lambdaW) </w:t>
+      </w:r>
+      <w:r>
+        <w:rPr>
+          <w:rStyle w:val="SpecialCharTok"/>
+        </w:rPr>
+        <w:t xml:space="preserve">%&gt;%</w:t>
+      </w:r>
+      <w:r>
+        <w:br/>
+      </w:r>
+      <w:r>
+        <w:rPr>
+          <w:rStyle w:val="NormalTok"/>
+        </w:rPr>
+        <w:t xml:space="preserve">  </w:t>
+      </w:r>
+      <w:r>
+        <w:rPr>
+          <w:rStyle w:val="FunctionTok"/>
+        </w:rPr>
+        <w:t xml:space="preserve">summarize</w:t>
+      </w:r>
+      <w:r>
+        <w:rPr>
+          <w:rStyle w:val="NormalTok"/>
+        </w:rPr>
+        <w:t xml:space="preserve">(</w:t>
+      </w:r>
+      <w:r>
+        <w:rPr>
+          <w:rStyle w:val="AttributeTok"/>
+        </w:rPr>
+        <w:t xml:space="preserve">c_mean =</w:t>
+      </w:r>
+      <w:r>
+        <w:rPr>
+          <w:rStyle w:val="NormalTok"/>
+        </w:rPr>
+        <w:t xml:space="preserve"> </w:t>
+      </w:r>
+      <w:r>
+        <w:rPr>
+          <w:rStyle w:val="FunctionTok"/>
+        </w:rPr>
+        <w:t xml:space="preserve">mean</w:t>
+      </w:r>
+      <w:r>
+        <w:rPr>
+          <w:rStyle w:val="NormalTok"/>
+        </w:rPr>
+        <w:t xml:space="preserve">(c_mean_f), </w:t>
+      </w:r>
+      <w:r>
+        <w:rPr>
+          <w:rStyle w:val="AttributeTok"/>
+        </w:rPr>
+        <w:t xml:space="preserve">pl_mean =</w:t>
+      </w:r>
+      <w:r>
+        <w:rPr>
+          <w:rStyle w:val="NormalTok"/>
+        </w:rPr>
+        <w:t xml:space="preserve"> </w:t>
+      </w:r>
+      <w:r>
+        <w:rPr>
+          <w:rStyle w:val="FunctionTok"/>
+        </w:rPr>
+        <w:t xml:space="preserve">mean</w:t>
+      </w:r>
+      <w:r>
+        <w:rPr>
+          <w:rStyle w:val="NormalTok"/>
+        </w:rPr>
+        <w:t xml:space="preserve">(pl_mean_f),</w:t>
+      </w:r>
+      <w:r>
+        <w:br/>
+      </w:r>
+      <w:r>
+        <w:rPr>
+          <w:rStyle w:val="NormalTok"/>
+        </w:rPr>
+        <w:t xml:space="preserve">            </w:t>
+      </w:r>
+      <w:r>
+        <w:rPr>
+          <w:rStyle w:val="AttributeTok"/>
+        </w:rPr>
+        <w:t xml:space="preserve">c_sd =</w:t>
+      </w:r>
+      <w:r>
+        <w:rPr>
+          <w:rStyle w:val="NormalTok"/>
+        </w:rPr>
+        <w:t xml:space="preserve"> </w:t>
+      </w:r>
+      <w:r>
+        <w:rPr>
+          <w:rStyle w:val="FunctionTok"/>
+        </w:rPr>
+        <w:t xml:space="preserve">sqrt</w:t>
+      </w:r>
+      <w:r>
+        <w:rPr>
+          <w:rStyle w:val="NormalTok"/>
+        </w:rPr>
+        <w:t xml:space="preserve">(</w:t>
+      </w:r>
+      <w:r>
+        <w:rPr>
+          <w:rStyle w:val="FunctionTok"/>
+        </w:rPr>
+        <w:t xml:space="preserve">sum</w:t>
+      </w:r>
+      <w:r>
+        <w:rPr>
+          <w:rStyle w:val="NormalTok"/>
+        </w:rPr>
+        <w:t xml:space="preserve">((c_mean_f</w:t>
+      </w:r>
+      <w:r>
+        <w:rPr>
+          <w:rStyle w:val="SpecialCharTok"/>
+        </w:rPr>
+        <w:t xml:space="preserve">-</w:t>
+      </w:r>
+      <w:r>
+        <w:rPr>
+          <w:rStyle w:val="NormalTok"/>
+        </w:rPr>
+        <w:t xml:space="preserve">c_mean)</w:t>
+      </w:r>
+      <w:r>
+        <w:rPr>
+          <w:rStyle w:val="SpecialCharTok"/>
+        </w:rPr>
+        <w:t xml:space="preserve">^</w:t>
+      </w:r>
+      <w:r>
+        <w:rPr>
+          <w:rStyle w:val="DecValTok"/>
+        </w:rPr>
+        <w:t xml:space="preserve">2</w:t>
+      </w:r>
+      <w:r>
+        <w:rPr>
+          <w:rStyle w:val="NormalTok"/>
+        </w:rPr>
+        <w:t xml:space="preserve">)</w:t>
+      </w:r>
+      <w:r>
+        <w:rPr>
+          <w:rStyle w:val="SpecialCharTok"/>
+        </w:rPr>
+        <w:t xml:space="preserve">/</w:t>
+      </w:r>
+      <w:r>
+        <w:rPr>
+          <w:rStyle w:val="NormalTok"/>
+        </w:rPr>
+        <w:t xml:space="preserve">(NFOLD</w:t>
+      </w:r>
+      <w:r>
+        <w:rPr>
+          <w:rStyle w:val="SpecialCharTok"/>
+        </w:rPr>
+        <w:t xml:space="preserve">*</w:t>
+      </w:r>
+      <w:r>
+        <w:rPr>
+          <w:rStyle w:val="NormalTok"/>
+        </w:rPr>
+        <w:t xml:space="preserve">(NFOLD</w:t>
+      </w:r>
+      <w:r>
+        <w:rPr>
+          <w:rStyle w:val="DecValTok"/>
+        </w:rPr>
+        <w:t xml:space="preserve">-1</w:t>
+      </w:r>
+      <w:r>
+        <w:rPr>
+          <w:rStyle w:val="NormalTok"/>
+        </w:rPr>
+        <w:t xml:space="preserve">))), </w:t>
+      </w:r>
+      <w:r>
+        <w:br/>
+      </w:r>
+      <w:r>
+        <w:rPr>
+          <w:rStyle w:val="NormalTok"/>
+        </w:rPr>
+        <w:t xml:space="preserve">            </w:t>
+      </w:r>
+      <w:r>
+        <w:rPr>
+          <w:rStyle w:val="AttributeTok"/>
+        </w:rPr>
+        <w:t xml:space="preserve">pl_sd =</w:t>
+      </w:r>
+      <w:r>
+        <w:rPr>
+          <w:rStyle w:val="NormalTok"/>
+        </w:rPr>
+        <w:t xml:space="preserve"> </w:t>
+      </w:r>
+      <w:r>
+        <w:rPr>
+          <w:rStyle w:val="FunctionTok"/>
+        </w:rPr>
+        <w:t xml:space="preserve">sqrt</w:t>
+      </w:r>
+      <w:r>
+        <w:rPr>
+          <w:rStyle w:val="NormalTok"/>
+        </w:rPr>
+        <w:t xml:space="preserve">(</w:t>
+      </w:r>
+      <w:r>
+        <w:rPr>
+          <w:rStyle w:val="FunctionTok"/>
+        </w:rPr>
+        <w:t xml:space="preserve">sum</w:t>
+      </w:r>
+      <w:r>
+        <w:rPr>
+          <w:rStyle w:val="NormalTok"/>
+        </w:rPr>
+        <w:t xml:space="preserve">((pl_mean_f</w:t>
+      </w:r>
+      <w:r>
+        <w:rPr>
+          <w:rStyle w:val="SpecialCharTok"/>
+        </w:rPr>
+        <w:t xml:space="preserve">-</w:t>
+      </w:r>
+      <w:r>
+        <w:rPr>
+          <w:rStyle w:val="NormalTok"/>
+        </w:rPr>
+        <w:t xml:space="preserve">pl_mean)</w:t>
+      </w:r>
+      <w:r>
+        <w:rPr>
+          <w:rStyle w:val="SpecialCharTok"/>
+        </w:rPr>
+        <w:t xml:space="preserve">^</w:t>
+      </w:r>
+      <w:r>
+        <w:rPr>
+          <w:rStyle w:val="DecValTok"/>
+        </w:rPr>
+        <w:t xml:space="preserve">2</w:t>
+      </w:r>
+      <w:r>
+        <w:rPr>
+          <w:rStyle w:val="NormalTok"/>
+        </w:rPr>
+        <w:t xml:space="preserve">)</w:t>
+      </w:r>
+      <w:r>
+        <w:rPr>
+          <w:rStyle w:val="SpecialCharTok"/>
+        </w:rPr>
+        <w:t xml:space="preserve">/</w:t>
+      </w:r>
+      <w:r>
+        <w:rPr>
+          <w:rStyle w:val="NormalTok"/>
+        </w:rPr>
+        <w:t xml:space="preserve">(NFOLD</w:t>
+      </w:r>
+      <w:r>
+        <w:rPr>
+          <w:rStyle w:val="SpecialCharTok"/>
+        </w:rPr>
+        <w:t xml:space="preserve">*</w:t>
+      </w:r>
+      <w:r>
+        <w:rPr>
+          <w:rStyle w:val="NormalTok"/>
+        </w:rPr>
+        <w:t xml:space="preserve">(NFOLD</w:t>
+      </w:r>
+      <w:r>
+        <w:rPr>
+          <w:rStyle w:val="DecValTok"/>
+        </w:rPr>
+        <w:t xml:space="preserve">-1</w:t>
+      </w:r>
+      <w:r>
+        <w:rPr>
+          <w:rStyle w:val="NormalTok"/>
+        </w:rPr>
+        <w:t xml:space="preserve">))))</w:t>
+      </w:r>
+      <w:r>
+        <w:rPr>
+          <w:rStyle w:val="SpecialCharTok"/>
+        </w:rPr>
+        <w:t xml:space="preserve">%&gt;%</w:t>
+      </w:r>
+      <w:r>
+        <w:br/>
+      </w:r>
+      <w:r>
+        <w:rPr>
+          <w:rStyle w:val="NormalTok"/>
+        </w:rPr>
+        <w:t xml:space="preserve">  </w:t>
+      </w:r>
+      <w:r>
+        <w:rPr>
+          <w:rStyle w:val="FunctionTok"/>
+        </w:rPr>
+        <w:t xml:space="preserve">ungroup</w:t>
+      </w:r>
+      <w:r>
+        <w:rPr>
+          <w:rStyle w:val="NormalTok"/>
+        </w:rPr>
+        <w:t xml:space="preserve">()</w:t>
       </w:r>
     </w:p>
     <w:p>
       <w:pPr>
-        <w:pStyle w:val="BodyText"/>
-      </w:pPr>
+        <w:pStyle w:val="SourceCode"/>
+      </w:pPr>
+      <w:r>
+        <w:rPr>
+          <w:rStyle w:val="VerbatimChar"/>
+        </w:rPr>
+        <w:t xml:space="preserve">## `summarise()` has grouped output by 'k', 'alpha', 'lambda', 'eta'. You can override using the</w:t>
+      </w:r>
+      <w:r>
+        <w:br/>
+      </w:r>
+      <w:r>
+        <w:rPr>
+          <w:rStyle w:val="VerbatimChar"/>
+        </w:rPr>
+        <w:t xml:space="preserve">## `.groups` argument.</w:t>
+      </w:r>
     </w:p>
     <w:p>
       <w:pPr>
-        <w:pStyle w:val="BodyText"/>
-      </w:pPr>
+        <w:pStyle w:val="SourceCode"/>
+      </w:pPr>
+      <w:r>
+        <w:rPr>
+          <w:rStyle w:val="NormalTok"/>
+        </w:rPr>
+        <w:t xml:space="preserve">avg_fold_fixed_lambda </w:t>
+      </w:r>
+      <w:r>
+        <w:rPr>
+          <w:rStyle w:val="OtherTok"/>
+        </w:rPr>
+        <w:t xml:space="preserve">=</w:t>
+      </w:r>
+      <w:r>
+        <w:rPr>
+          <w:rStyle w:val="NormalTok"/>
+        </w:rPr>
+        <w:t xml:space="preserve"> avg_fold </w:t>
+      </w:r>
+      <w:r>
+        <w:rPr>
+          <w:rStyle w:val="SpecialCharTok"/>
+        </w:rPr>
+        <w:t xml:space="preserve">%&gt;%</w:t>
+      </w:r>
+      <w:r>
+        <w:rPr>
+          <w:rStyle w:val="NormalTok"/>
+        </w:rPr>
+        <w:t xml:space="preserve"> </w:t>
+      </w:r>
+      <w:r>
+        <w:rPr>
+          <w:rStyle w:val="FunctionTok"/>
+        </w:rPr>
+        <w:t xml:space="preserve">filter</w:t>
+      </w:r>
+      <w:r>
+        <w:rPr>
+          <w:rStyle w:val="NormalTok"/>
+        </w:rPr>
+        <w:t xml:space="preserve">(lambda</w:t>
+      </w:r>
+      <w:r>
+        <w:rPr>
+          <w:rStyle w:val="SpecialCharTok"/>
+        </w:rPr>
+        <w:t xml:space="preserve">==</w:t>
+      </w:r>
+      <w:r>
+        <w:rPr>
+          <w:rStyle w:val="DecValTok"/>
+        </w:rPr>
+        <w:t xml:space="preserve">10</w:t>
+      </w:r>
+      <w:r>
+        <w:rPr>
+          <w:rStyle w:val="NormalTok"/>
+        </w:rPr>
+        <w:t xml:space="preserve">)</w:t>
+      </w:r>
+      <w:r>
+        <w:br/>
+      </w:r>
+      <w:r>
+        <w:br/>
+      </w:r>
+      <w:r>
+        <w:rPr>
+          <w:rStyle w:val="NormalTok"/>
+        </w:rPr>
+        <w:t xml:space="preserve">heat </w:t>
+      </w:r>
+      <w:r>
+        <w:rPr>
+          <w:rStyle w:val="OtherTok"/>
+        </w:rPr>
+        <w:t xml:space="preserve">=</w:t>
+      </w:r>
+      <w:r>
+        <w:rPr>
+          <w:rStyle w:val="NormalTok"/>
+        </w:rPr>
+        <w:t xml:space="preserve"> </w:t>
+      </w:r>
+      <w:r>
+        <w:rPr>
+          <w:rStyle w:val="FunctionTok"/>
+        </w:rPr>
+        <w:t xml:space="preserve">ggplot</w:t>
+      </w:r>
+      <w:r>
+        <w:rPr>
+          <w:rStyle w:val="NormalTok"/>
+        </w:rPr>
+        <w:t xml:space="preserve">(avg_fold_fixed_lambda,</w:t>
+      </w:r>
+      <w:r>
+        <w:rPr>
+          <w:rStyle w:val="FunctionTok"/>
+        </w:rPr>
+        <w:t xml:space="preserve">aes</w:t>
+      </w:r>
+      <w:r>
+        <w:rPr>
+          <w:rStyle w:val="NormalTok"/>
+        </w:rPr>
+        <w:t xml:space="preserve">(</w:t>
+      </w:r>
+      <w:r>
+        <w:rPr>
+          <w:rStyle w:val="AttributeTok"/>
+        </w:rPr>
+        <w:t xml:space="preserve">x=</w:t>
+      </w:r>
+      <w:r>
+        <w:rPr>
+          <w:rStyle w:val="NormalTok"/>
+        </w:rPr>
+        <w:t xml:space="preserve">alpha,</w:t>
+      </w:r>
+      <w:r>
+        <w:rPr>
+          <w:rStyle w:val="AttributeTok"/>
+        </w:rPr>
+        <w:t xml:space="preserve">y=</w:t>
+      </w:r>
+      <w:r>
+        <w:rPr>
+          <w:rStyle w:val="NormalTok"/>
+        </w:rPr>
+        <w:t xml:space="preserve">k,</w:t>
+      </w:r>
+      <w:r>
+        <w:rPr>
+          <w:rStyle w:val="AttributeTok"/>
+        </w:rPr>
+        <w:t xml:space="preserve">fill=</w:t>
+      </w:r>
+      <w:r>
+        <w:rPr>
+          <w:rStyle w:val="NormalTok"/>
+        </w:rPr>
+        <w:t xml:space="preserve">c_mean))</w:t>
+      </w:r>
+      <w:r>
+        <w:rPr>
+          <w:rStyle w:val="SpecialCharTok"/>
+        </w:rPr>
+        <w:t xml:space="preserve">+</w:t>
+      </w:r>
+      <w:r>
+        <w:br/>
+      </w:r>
+      <w:r>
+        <w:rPr>
+          <w:rStyle w:val="NormalTok"/>
+        </w:rPr>
+        <w:t xml:space="preserve">  </w:t>
+      </w:r>
+      <w:r>
+        <w:rPr>
+          <w:rStyle w:val="FunctionTok"/>
+        </w:rPr>
+        <w:t xml:space="preserve">geom_tile</w:t>
+      </w:r>
+      <w:r>
+        <w:rPr>
+          <w:rStyle w:val="NormalTok"/>
+        </w:rPr>
+        <w:t xml:space="preserve">()</w:t>
+      </w:r>
+      <w:r>
+        <w:rPr>
+          <w:rStyle w:val="SpecialCharTok"/>
+        </w:rPr>
+        <w:t xml:space="preserve">+</w:t>
+      </w:r>
+      <w:r>
+        <w:br/>
+      </w:r>
+      <w:r>
+        <w:rPr>
+          <w:rStyle w:val="NormalTok"/>
+        </w:rPr>
+        <w:t xml:space="preserve">  </w:t>
+      </w:r>
+      <w:r>
+        <w:rPr>
+          <w:rStyle w:val="FunctionTok"/>
+        </w:rPr>
+        <w:t xml:space="preserve">theme_classic</w:t>
+      </w:r>
+      <w:r>
+        <w:rPr>
+          <w:rStyle w:val="NormalTok"/>
+        </w:rPr>
+        <w:t xml:space="preserve">(</w:t>
+      </w:r>
+      <w:r>
+        <w:rPr>
+          <w:rStyle w:val="AttributeTok"/>
+        </w:rPr>
+        <w:t xml:space="preserve">base_size=</w:t>
+      </w:r>
+      <w:r>
+        <w:rPr>
+          <w:rStyle w:val="DecValTok"/>
+        </w:rPr>
+        <w:t xml:space="preserve">12</w:t>
+      </w:r>
+      <w:r>
+        <w:rPr>
+          <w:rStyle w:val="NormalTok"/>
+        </w:rPr>
+        <w:t xml:space="preserve">)</w:t>
+      </w:r>
+      <w:r>
+        <w:rPr>
+          <w:rStyle w:val="SpecialCharTok"/>
+        </w:rPr>
+        <w:t xml:space="preserve">+</w:t>
+      </w:r>
+      <w:r>
+        <w:rPr>
+          <w:rStyle w:val="FunctionTok"/>
+        </w:rPr>
+        <w:t xml:space="preserve">theme</w:t>
+      </w:r>
+      <w:r>
+        <w:rPr>
+          <w:rStyle w:val="NormalTok"/>
+        </w:rPr>
+        <w:t xml:space="preserve">(</w:t>
+      </w:r>
+      <w:r>
+        <w:rPr>
+          <w:rStyle w:val="AttributeTok"/>
+        </w:rPr>
+        <w:t xml:space="preserve">panel.grid =</w:t>
+      </w:r>
+      <w:r>
+        <w:rPr>
+          <w:rStyle w:val="NormalTok"/>
+        </w:rPr>
+        <w:t xml:space="preserve"> </w:t>
+      </w:r>
+      <w:r>
+        <w:rPr>
+          <w:rStyle w:val="FunctionTok"/>
+        </w:rPr>
+        <w:t xml:space="preserve">element_blank</w:t>
+      </w:r>
+      <w:r>
+        <w:rPr>
+          <w:rStyle w:val="NormalTok"/>
+        </w:rPr>
+        <w:t xml:space="preserve">(),</w:t>
+      </w:r>
+      <w:r>
+        <w:br/>
+      </w:r>
+      <w:r>
+        <w:rPr>
+          <w:rStyle w:val="NormalTok"/>
+        </w:rPr>
+        <w:t xml:space="preserve">                                    </w:t>
+      </w:r>
+      <w:r>
+        <w:rPr>
+          <w:rStyle w:val="AttributeTok"/>
+        </w:rPr>
+        <w:t xml:space="preserve">axis.line  =</w:t>
+      </w:r>
+      <w:r>
+        <w:rPr>
+          <w:rStyle w:val="NormalTok"/>
+        </w:rPr>
+        <w:t xml:space="preserve"> </w:t>
+      </w:r>
+      <w:r>
+        <w:rPr>
+          <w:rStyle w:val="FunctionTok"/>
+        </w:rPr>
+        <w:t xml:space="preserve">element_blank</w:t>
+      </w:r>
+      <w:r>
+        <w:rPr>
+          <w:rStyle w:val="NormalTok"/>
+        </w:rPr>
+        <w:t xml:space="preserve">(), </w:t>
+      </w:r>
+      <w:r>
+        <w:br/>
+      </w:r>
+      <w:r>
+        <w:rPr>
+          <w:rStyle w:val="NormalTok"/>
+        </w:rPr>
+        <w:t xml:space="preserve">                                    </w:t>
+      </w:r>
+      <w:r>
+        <w:rPr>
+          <w:rStyle w:val="AttributeTok"/>
+        </w:rPr>
+        <w:t xml:space="preserve">axis.text =</w:t>
+      </w:r>
+      <w:r>
+        <w:rPr>
+          <w:rStyle w:val="NormalTok"/>
+        </w:rPr>
+        <w:t xml:space="preserve"> </w:t>
+      </w:r>
+      <w:r>
+        <w:rPr>
+          <w:rStyle w:val="FunctionTok"/>
+        </w:rPr>
+        <w:t xml:space="preserve">element_text</w:t>
+      </w:r>
+      <w:r>
+        <w:rPr>
+          <w:rStyle w:val="NormalTok"/>
+        </w:rPr>
+        <w:t xml:space="preserve">(</w:t>
+      </w:r>
+      <w:r>
+        <w:rPr>
+          <w:rStyle w:val="AttributeTok"/>
+        </w:rPr>
+        <w:t xml:space="preserve">size=</w:t>
+      </w:r>
+      <w:r>
+        <w:rPr>
+          <w:rStyle w:val="DecValTok"/>
+        </w:rPr>
+        <w:t xml:space="preserve">11</w:t>
+      </w:r>
+      <w:r>
+        <w:rPr>
+          <w:rStyle w:val="NormalTok"/>
+        </w:rPr>
+        <w:t xml:space="preserve">))</w:t>
+      </w:r>
+      <w:r>
+        <w:rPr>
+          <w:rStyle w:val="SpecialCharTok"/>
+        </w:rPr>
+        <w:t xml:space="preserve">+</w:t>
+      </w:r>
+      <w:r>
+        <w:br/>
+      </w:r>
+      <w:r>
+        <w:rPr>
+          <w:rStyle w:val="NormalTok"/>
+        </w:rPr>
+        <w:t xml:space="preserve">  </w:t>
+      </w:r>
+      <w:r>
+        <w:rPr>
+          <w:rStyle w:val="FunctionTok"/>
+        </w:rPr>
+        <w:t xml:space="preserve">scale_y_continuous</w:t>
+      </w:r>
+      <w:r>
+        <w:rPr>
+          <w:rStyle w:val="NormalTok"/>
+        </w:rPr>
+        <w:t xml:space="preserve">(</w:t>
+      </w:r>
+      <w:r>
+        <w:rPr>
+          <w:rStyle w:val="AttributeTok"/>
+        </w:rPr>
+        <w:t xml:space="preserve">expand=</w:t>
+      </w:r>
+      <w:r>
+        <w:rPr>
+          <w:rStyle w:val="FunctionTok"/>
+        </w:rPr>
+        <w:t xml:space="preserve">c</w:t>
+      </w:r>
+      <w:r>
+        <w:rPr>
+          <w:rStyle w:val="NormalTok"/>
+        </w:rPr>
+        <w:t xml:space="preserve">(</w:t>
+      </w:r>
+      <w:r>
+        <w:rPr>
+          <w:rStyle w:val="DecValTok"/>
+        </w:rPr>
+        <w:t xml:space="preserve">0</w:t>
+      </w:r>
+      <w:r>
+        <w:rPr>
+          <w:rStyle w:val="NormalTok"/>
+        </w:rPr>
+        <w:t xml:space="preserve">,</w:t>
+      </w:r>
+      <w:r>
+        <w:rPr>
+          <w:rStyle w:val="DecValTok"/>
+        </w:rPr>
+        <w:t xml:space="preserve">0</w:t>
+      </w:r>
+      <w:r>
+        <w:rPr>
+          <w:rStyle w:val="NormalTok"/>
+        </w:rPr>
+        <w:t xml:space="preserve">),</w:t>
+      </w:r>
+      <w:r>
+        <w:rPr>
+          <w:rStyle w:val="AttributeTok"/>
+        </w:rPr>
+        <w:t xml:space="preserve">breaks=</w:t>
+      </w:r>
+      <w:r>
+        <w:rPr>
+          <w:rStyle w:val="DecValTok"/>
+        </w:rPr>
+        <w:t xml:space="preserve">1</w:t>
+      </w:r>
+      <w:r>
+        <w:rPr>
+          <w:rStyle w:val="SpecialCharTok"/>
+        </w:rPr>
+        <w:t xml:space="preserve">:</w:t>
+      </w:r>
+      <w:r>
+        <w:rPr>
+          <w:rStyle w:val="DecValTok"/>
+        </w:rPr>
+        <w:t xml:space="preserve">12</w:t>
+      </w:r>
+      <w:r>
+        <w:rPr>
+          <w:rStyle w:val="NormalTok"/>
+        </w:rPr>
+        <w:t xml:space="preserve">)</w:t>
+      </w:r>
+      <w:r>
+        <w:rPr>
+          <w:rStyle w:val="SpecialCharTok"/>
+        </w:rPr>
+        <w:t xml:space="preserve">+</w:t>
+      </w:r>
+      <w:r>
+        <w:br/>
+      </w:r>
+      <w:r>
+        <w:rPr>
+          <w:rStyle w:val="NormalTok"/>
+        </w:rPr>
+        <w:t xml:space="preserve">  </w:t>
+      </w:r>
+      <w:r>
+        <w:rPr>
+          <w:rStyle w:val="FunctionTok"/>
+        </w:rPr>
+        <w:t xml:space="preserve">scale_x_continuous</w:t>
+      </w:r>
+      <w:r>
+        <w:rPr>
+          <w:rStyle w:val="NormalTok"/>
+        </w:rPr>
+        <w:t xml:space="preserve">(</w:t>
+      </w:r>
+      <w:r>
+        <w:rPr>
+          <w:rStyle w:val="AttributeTok"/>
+        </w:rPr>
+        <w:t xml:space="preserve">expand=</w:t>
+      </w:r>
+      <w:r>
+        <w:rPr>
+          <w:rStyle w:val="FunctionTok"/>
+        </w:rPr>
+        <w:t xml:space="preserve">c</w:t>
+      </w:r>
+      <w:r>
+        <w:rPr>
+          <w:rStyle w:val="NormalTok"/>
+        </w:rPr>
+        <w:t xml:space="preserve">(</w:t>
+      </w:r>
+      <w:r>
+        <w:rPr>
+          <w:rStyle w:val="DecValTok"/>
+        </w:rPr>
+        <w:t xml:space="preserve">0</w:t>
+      </w:r>
+      <w:r>
+        <w:rPr>
+          <w:rStyle w:val="NormalTok"/>
+        </w:rPr>
+        <w:t xml:space="preserve">,</w:t>
+      </w:r>
+      <w:r>
+        <w:rPr>
+          <w:rStyle w:val="DecValTok"/>
+        </w:rPr>
+        <w:t xml:space="preserve">0</w:t>
+      </w:r>
+      <w:r>
+        <w:rPr>
+          <w:rStyle w:val="NormalTok"/>
+        </w:rPr>
+        <w:t xml:space="preserve">),</w:t>
+      </w:r>
+      <w:r>
+        <w:rPr>
+          <w:rStyle w:val="AttributeTok"/>
+        </w:rPr>
+        <w:t xml:space="preserve">breaks =</w:t>
+      </w:r>
+      <w:r>
+        <w:rPr>
+          <w:rStyle w:val="NormalTok"/>
+        </w:rPr>
+        <w:t xml:space="preserve"> </w:t>
+      </w:r>
+      <w:r>
+        <w:rPr>
+          <w:rStyle w:val="FunctionTok"/>
+        </w:rPr>
+        <w:t xml:space="preserve">c</w:t>
+      </w:r>
+      <w:r>
+        <w:rPr>
+          <w:rStyle w:val="NormalTok"/>
+        </w:rPr>
+        <w:t xml:space="preserve">(</w:t>
+      </w:r>
+      <w:r>
+        <w:rPr>
+          <w:rStyle w:val="DecValTok"/>
+        </w:rPr>
+        <w:t xml:space="preserve">0</w:t>
+      </w:r>
+      <w:r>
+        <w:rPr>
+          <w:rStyle w:val="NormalTok"/>
+        </w:rPr>
+        <w:t xml:space="preserve">,.</w:t>
+      </w:r>
+      <w:r>
+        <w:rPr>
+          <w:rStyle w:val="DecValTok"/>
+        </w:rPr>
+        <w:t xml:space="preserve">25</w:t>
+      </w:r>
+      <w:r>
+        <w:rPr>
+          <w:rStyle w:val="NormalTok"/>
+        </w:rPr>
+        <w:t xml:space="preserve">,.</w:t>
+      </w:r>
+      <w:r>
+        <w:rPr>
+          <w:rStyle w:val="DecValTok"/>
+        </w:rPr>
+        <w:t xml:space="preserve">5</w:t>
+      </w:r>
+      <w:r>
+        <w:rPr>
+          <w:rStyle w:val="NormalTok"/>
+        </w:rPr>
+        <w:t xml:space="preserve">,.</w:t>
+      </w:r>
+      <w:r>
+        <w:rPr>
+          <w:rStyle w:val="DecValTok"/>
+        </w:rPr>
+        <w:t xml:space="preserve">75</w:t>
+      </w:r>
+      <w:r>
+        <w:rPr>
+          <w:rStyle w:val="NormalTok"/>
+        </w:rPr>
+        <w:t xml:space="preserve">,</w:t>
+      </w:r>
+      <w:r>
+        <w:rPr>
+          <w:rStyle w:val="DecValTok"/>
+        </w:rPr>
+        <w:t xml:space="preserve">1</w:t>
+      </w:r>
+      <w:r>
+        <w:rPr>
+          <w:rStyle w:val="NormalTok"/>
+        </w:rPr>
+        <w:t xml:space="preserve">))</w:t>
+      </w:r>
+      <w:r>
+        <w:rPr>
+          <w:rStyle w:val="SpecialCharTok"/>
+        </w:rPr>
+        <w:t xml:space="preserve">+</w:t>
+      </w:r>
+      <w:r>
+        <w:br/>
+      </w:r>
+      <w:r>
+        <w:rPr>
+          <w:rStyle w:val="NormalTok"/>
+        </w:rPr>
+        <w:t xml:space="preserve">  </w:t>
+      </w:r>
+      <w:r>
+        <w:rPr>
+          <w:rStyle w:val="FunctionTok"/>
+        </w:rPr>
+        <w:t xml:space="preserve">labs</w:t>
+      </w:r>
+      <w:r>
+        <w:rPr>
+          <w:rStyle w:val="NormalTok"/>
+        </w:rPr>
+        <w:t xml:space="preserve">(</w:t>
+      </w:r>
+      <w:r>
+        <w:rPr>
+          <w:rStyle w:val="AttributeTok"/>
+        </w:rPr>
+        <w:t xml:space="preserve">fill=</w:t>
+      </w:r>
+      <w:r>
+        <w:rPr>
+          <w:rStyle w:val="StringTok"/>
+        </w:rPr>
+        <w:t xml:space="preserve">"CV C-index"</w:t>
+      </w:r>
+      <w:r>
+        <w:rPr>
+          <w:rStyle w:val="NormalTok"/>
+        </w:rPr>
+        <w:t xml:space="preserve">)</w:t>
+      </w:r>
+      <w:r>
+        <w:rPr>
+          <w:rStyle w:val="SpecialCharTok"/>
+        </w:rPr>
+        <w:t xml:space="preserve">+</w:t>
+      </w:r>
+      <w:r>
+        <w:br/>
+      </w:r>
+      <w:r>
+        <w:rPr>
+          <w:rStyle w:val="NormalTok"/>
+        </w:rPr>
+        <w:t xml:space="preserve">  </w:t>
+      </w:r>
+      <w:r>
+        <w:rPr>
+          <w:rStyle w:val="FunctionTok"/>
+        </w:rPr>
+        <w:t xml:space="preserve">scale_fill_viridis_c</w:t>
+      </w:r>
+      <w:r>
+        <w:rPr>
+          <w:rStyle w:val="NormalTok"/>
+        </w:rPr>
+        <w:t xml:space="preserve">(</w:t>
+      </w:r>
+      <w:r>
+        <w:rPr>
+          <w:rStyle w:val="AttributeTok"/>
+        </w:rPr>
+        <w:t xml:space="preserve">option=</w:t>
+      </w:r>
+      <w:r>
+        <w:rPr>
+          <w:rStyle w:val="StringTok"/>
+        </w:rPr>
+        <w:t xml:space="preserve">"magma"</w:t>
+      </w:r>
+      <w:r>
+        <w:rPr>
+          <w:rStyle w:val="NormalTok"/>
+        </w:rPr>
+        <w:t xml:space="preserve">,</w:t>
+      </w:r>
+      <w:r>
+        <w:rPr>
+          <w:rStyle w:val="AttributeTok"/>
+        </w:rPr>
+        <w:t xml:space="preserve">direction=</w:t>
+      </w:r>
+      <w:r>
+        <w:rPr>
+          <w:rStyle w:val="SpecialCharTok"/>
+        </w:rPr>
+        <w:t xml:space="preserve">-</w:t>
+      </w:r>
+      <w:r>
+        <w:rPr>
+          <w:rStyle w:val="DecValTok"/>
+        </w:rPr>
+        <w:t xml:space="preserve">1</w:t>
+      </w:r>
+      <w:r>
+        <w:rPr>
+          <w:rStyle w:val="NormalTok"/>
+        </w:rPr>
+        <w:t xml:space="preserve">,</w:t>
+      </w:r>
+      <w:r>
+        <w:rPr>
+          <w:rStyle w:val="AttributeTok"/>
+        </w:rPr>
+        <w:t xml:space="preserve">labels=</w:t>
+      </w:r>
+      <w:r>
+        <w:rPr>
+          <w:rStyle w:val="NormalTok"/>
+        </w:rPr>
+        <w:t xml:space="preserve">scales</w:t>
+      </w:r>
+      <w:r>
+        <w:rPr>
+          <w:rStyle w:val="SpecialCharTok"/>
+        </w:rPr>
+        <w:t xml:space="preserve">::</w:t>
+      </w:r>
+      <w:r>
+        <w:rPr>
+          <w:rStyle w:val="FunctionTok"/>
+        </w:rPr>
+        <w:t xml:space="preserve">label_number</w:t>
+      </w:r>
+      <w:r>
+        <w:rPr>
+          <w:rStyle w:val="NormalTok"/>
+        </w:rPr>
+        <w:t xml:space="preserve">(</w:t>
+      </w:r>
+      <w:r>
+        <w:rPr>
+          <w:rStyle w:val="AttributeTok"/>
+        </w:rPr>
+        <w:t xml:space="preserve">accuracy=</w:t>
+      </w:r>
+      <w:r>
+        <w:rPr>
+          <w:rStyle w:val="FloatTok"/>
+        </w:rPr>
+        <w:t xml:space="preserve">0.01</w:t>
+      </w:r>
+      <w:r>
+        <w:rPr>
+          <w:rStyle w:val="NormalTok"/>
+        </w:rPr>
+        <w:t xml:space="preserve">))</w:t>
+      </w:r>
+      <w:r>
+        <w:br/>
+      </w:r>
+      <w:r>
+        <w:br/>
+      </w:r>
+      <w:r>
+        <w:rPr>
+          <w:rStyle w:val="NormalTok"/>
+        </w:rPr>
+        <w:t xml:space="preserve">avg_fold_sub_k </w:t>
+      </w:r>
+      <w:r>
+        <w:rPr>
+          <w:rStyle w:val="OtherTok"/>
+        </w:rPr>
+        <w:t xml:space="preserve">=</w:t>
+      </w:r>
+      <w:r>
+        <w:rPr>
+          <w:rStyle w:val="NormalTok"/>
+        </w:rPr>
+        <w:t xml:space="preserve"> avg_fold_fixed_lambda </w:t>
+      </w:r>
+      <w:r>
+        <w:rPr>
+          <w:rStyle w:val="SpecialCharTok"/>
+        </w:rPr>
+        <w:t xml:space="preserve">%&gt;%</w:t>
+      </w:r>
+      <w:r>
+        <w:rPr>
+          <w:rStyle w:val="NormalTok"/>
+        </w:rPr>
+        <w:t xml:space="preserve"> </w:t>
+      </w:r>
+      <w:r>
+        <w:rPr>
+          <w:rStyle w:val="FunctionTok"/>
+        </w:rPr>
+        <w:t xml:space="preserve">filter</w:t>
+      </w:r>
+      <w:r>
+        <w:rPr>
+          <w:rStyle w:val="NormalTok"/>
+        </w:rPr>
+        <w:t xml:space="preserve">(k </w:t>
+      </w:r>
+      <w:r>
+        <w:rPr>
+          <w:rStyle w:val="SpecialCharTok"/>
+        </w:rPr>
+        <w:t xml:space="preserve">%in%</w:t>
+      </w:r>
+      <w:r>
+        <w:rPr>
+          <w:rStyle w:val="NormalTok"/>
+        </w:rPr>
+        <w:t xml:space="preserve"> </w:t>
+      </w:r>
+      <w:r>
+        <w:rPr>
+          <w:rStyle w:val="FunctionTok"/>
+        </w:rPr>
+        <w:t xml:space="preserve">c</w:t>
+      </w:r>
+      <w:r>
+        <w:rPr>
+          <w:rStyle w:val="NormalTok"/>
+        </w:rPr>
+        <w:t xml:space="preserve">(</w:t>
+      </w:r>
+      <w:r>
+        <w:rPr>
+          <w:rStyle w:val="DecValTok"/>
+        </w:rPr>
+        <w:t xml:space="preserve">4</w:t>
+      </w:r>
+      <w:r>
+        <w:rPr>
+          <w:rStyle w:val="NormalTok"/>
+        </w:rPr>
+        <w:t xml:space="preserve">,</w:t>
+      </w:r>
+      <w:r>
+        <w:rPr>
+          <w:rStyle w:val="DecValTok"/>
+        </w:rPr>
+        <w:t xml:space="preserve">6</w:t>
+      </w:r>
+      <w:r>
+        <w:rPr>
+          <w:rStyle w:val="NormalTok"/>
+        </w:rPr>
+        <w:t xml:space="preserve">,</w:t>
+      </w:r>
+      <w:r>
+        <w:rPr>
+          <w:rStyle w:val="DecValTok"/>
+        </w:rPr>
+        <w:t xml:space="preserve">8</w:t>
+      </w:r>
+      <w:r>
+        <w:rPr>
+          <w:rStyle w:val="NormalTok"/>
+        </w:rPr>
+        <w:t xml:space="preserve">,</w:t>
+      </w:r>
+      <w:r>
+        <w:rPr>
+          <w:rStyle w:val="DecValTok"/>
+        </w:rPr>
+        <w:t xml:space="preserve">12</w:t>
+      </w:r>
+      <w:r>
+        <w:rPr>
+          <w:rStyle w:val="NormalTok"/>
+        </w:rPr>
+        <w:t xml:space="preserve">))</w:t>
+      </w:r>
+      <w:r>
+        <w:br/>
+      </w:r>
+      <w:r>
+        <w:rPr>
+          <w:rStyle w:val="NormalTok"/>
+        </w:rPr>
+        <w:t xml:space="preserve">avg_fold_sub_k</w:t>
+      </w:r>
+      <w:r>
+        <w:rPr>
+          <w:rStyle w:val="SpecialCharTok"/>
+        </w:rPr>
+        <w:t xml:space="preserve">$</w:t>
+      </w:r>
+      <w:r>
+        <w:rPr>
+          <w:rStyle w:val="NormalTok"/>
+        </w:rPr>
+        <w:t xml:space="preserve">k_lab </w:t>
+      </w:r>
+      <w:r>
+        <w:rPr>
+          <w:rStyle w:val="OtherTok"/>
+        </w:rPr>
+        <w:t xml:space="preserve">=</w:t>
+      </w:r>
+      <w:r>
+        <w:rPr>
+          <w:rStyle w:val="NormalTok"/>
+        </w:rPr>
+        <w:t xml:space="preserve"> </w:t>
+      </w:r>
+      <w:r>
+        <w:rPr>
+          <w:rStyle w:val="FunctionTok"/>
+        </w:rPr>
+        <w:t xml:space="preserve">factor</w:t>
+      </w:r>
+      <w:r>
+        <w:rPr>
+          <w:rStyle w:val="NormalTok"/>
+        </w:rPr>
+        <w:t xml:space="preserve">(avg_fold_sub_k</w:t>
+      </w:r>
+      <w:r>
+        <w:rPr>
+          <w:rStyle w:val="SpecialCharTok"/>
+        </w:rPr>
+        <w:t xml:space="preserve">$</w:t>
+      </w:r>
+      <w:r>
+        <w:rPr>
+          <w:rStyle w:val="NormalTok"/>
+        </w:rPr>
+        <w:t xml:space="preserve">k, </w:t>
+      </w:r>
+      <w:r>
+        <w:rPr>
+          <w:rStyle w:val="AttributeTok"/>
+        </w:rPr>
+        <w:t xml:space="preserve">labels=</w:t>
+      </w:r>
+      <w:r>
+        <w:rPr>
+          <w:rStyle w:val="FunctionTok"/>
+        </w:rPr>
+        <w:t xml:space="preserve">paste0</w:t>
+      </w:r>
+      <w:r>
+        <w:rPr>
+          <w:rStyle w:val="NormalTok"/>
+        </w:rPr>
+        <w:t xml:space="preserve">(</w:t>
+      </w:r>
+      <w:r>
+        <w:rPr>
+          <w:rStyle w:val="StringTok"/>
+        </w:rPr>
+        <w:t xml:space="preserve">"k = "</w:t>
+      </w:r>
+      <w:r>
+        <w:rPr>
+          <w:rStyle w:val="NormalTok"/>
+        </w:rPr>
+        <w:t xml:space="preserve">,</w:t>
+      </w:r>
+      <w:r>
+        <w:rPr>
+          <w:rStyle w:val="FunctionTok"/>
+        </w:rPr>
+        <w:t xml:space="preserve">c</w:t>
+      </w:r>
+      <w:r>
+        <w:rPr>
+          <w:rStyle w:val="NormalTok"/>
+        </w:rPr>
+        <w:t xml:space="preserve">(</w:t>
+      </w:r>
+      <w:r>
+        <w:rPr>
+          <w:rStyle w:val="DecValTok"/>
+        </w:rPr>
+        <w:t xml:space="preserve">4</w:t>
+      </w:r>
+      <w:r>
+        <w:rPr>
+          <w:rStyle w:val="NormalTok"/>
+        </w:rPr>
+        <w:t xml:space="preserve">,</w:t>
+      </w:r>
+      <w:r>
+        <w:rPr>
+          <w:rStyle w:val="DecValTok"/>
+        </w:rPr>
+        <w:t xml:space="preserve">6</w:t>
+      </w:r>
+      <w:r>
+        <w:rPr>
+          <w:rStyle w:val="NormalTok"/>
+        </w:rPr>
+        <w:t xml:space="preserve">,</w:t>
+      </w:r>
+      <w:r>
+        <w:rPr>
+          <w:rStyle w:val="DecValTok"/>
+        </w:rPr>
+        <w:t xml:space="preserve">8</w:t>
+      </w:r>
+      <w:r>
+        <w:rPr>
+          <w:rStyle w:val="NormalTok"/>
+        </w:rPr>
+        <w:t xml:space="preserve">,</w:t>
+      </w:r>
+      <w:r>
+        <w:rPr>
+          <w:rStyle w:val="DecValTok"/>
+        </w:rPr>
+        <w:t xml:space="preserve">12</w:t>
+      </w:r>
+      <w:r>
+        <w:rPr>
+          <w:rStyle w:val="NormalTok"/>
+        </w:rPr>
+        <w:t xml:space="preserve">)))</w:t>
+      </w:r>
+      <w:r>
+        <w:br/>
+      </w:r>
+      <w:r>
+        <w:br/>
+      </w:r>
+      <w:r>
+        <w:rPr>
+          <w:rStyle w:val="NormalTok"/>
+        </w:rPr>
+        <w:t xml:space="preserve">panels </w:t>
+      </w:r>
+      <w:r>
+        <w:rPr>
+          <w:rStyle w:val="OtherTok"/>
+        </w:rPr>
+        <w:t xml:space="preserve">=</w:t>
+      </w:r>
+      <w:r>
+        <w:rPr>
+          <w:rStyle w:val="NormalTok"/>
+        </w:rPr>
+        <w:t xml:space="preserve"> </w:t>
+      </w:r>
+      <w:r>
+        <w:rPr>
+          <w:rStyle w:val="FunctionTok"/>
+        </w:rPr>
+        <w:t xml:space="preserve">ggplot</w:t>
+      </w:r>
+      <w:r>
+        <w:rPr>
+          <w:rStyle w:val="NormalTok"/>
+        </w:rPr>
+        <w:t xml:space="preserve">(avg_fold_sub_k, </w:t>
+      </w:r>
+      <w:r>
+        <w:rPr>
+          <w:rStyle w:val="FunctionTok"/>
+        </w:rPr>
+        <w:t xml:space="preserve">aes</w:t>
+      </w:r>
+      <w:r>
+        <w:rPr>
+          <w:rStyle w:val="NormalTok"/>
+        </w:rPr>
+        <w:t xml:space="preserve">(</w:t>
+      </w:r>
+      <w:r>
+        <w:rPr>
+          <w:rStyle w:val="AttributeTok"/>
+        </w:rPr>
+        <w:t xml:space="preserve">x=</w:t>
+      </w:r>
+      <w:r>
+        <w:rPr>
+          <w:rStyle w:val="NormalTok"/>
+        </w:rPr>
+        <w:t xml:space="preserve">alpha,</w:t>
+      </w:r>
+      <w:r>
+        <w:rPr>
+          <w:rStyle w:val="AttributeTok"/>
+        </w:rPr>
+        <w:t xml:space="preserve">y=</w:t>
+      </w:r>
+      <w:r>
+        <w:rPr>
+          <w:rStyle w:val="NormalTok"/>
+        </w:rPr>
+        <w:t xml:space="preserve">c_mean))</w:t>
+      </w:r>
+      <w:r>
+        <w:rPr>
+          <w:rStyle w:val="SpecialCharTok"/>
+        </w:rPr>
+        <w:t xml:space="preserve">+</w:t>
+      </w:r>
+      <w:r>
+        <w:br/>
+      </w:r>
+      <w:r>
+        <w:rPr>
+          <w:rStyle w:val="NormalTok"/>
+        </w:rPr>
+        <w:t xml:space="preserve">  </w:t>
+      </w:r>
+      <w:r>
+        <w:rPr>
+          <w:rStyle w:val="FunctionTok"/>
+        </w:rPr>
+        <w:t xml:space="preserve">geom_point</w:t>
+      </w:r>
+      <w:r>
+        <w:rPr>
+          <w:rStyle w:val="NormalTok"/>
+        </w:rPr>
+        <w:t xml:space="preserve">()</w:t>
+      </w:r>
+      <w:r>
+        <w:rPr>
+          <w:rStyle w:val="SpecialCharTok"/>
+        </w:rPr>
+        <w:t xml:space="preserve">+</w:t>
+      </w:r>
+      <w:r>
+        <w:br/>
+      </w:r>
+      <w:r>
+        <w:rPr>
+          <w:rStyle w:val="NormalTok"/>
+        </w:rPr>
+        <w:t xml:space="preserve">  </w:t>
+      </w:r>
+      <w:r>
+        <w:rPr>
+          <w:rStyle w:val="FunctionTok"/>
+        </w:rPr>
+        <w:t xml:space="preserve">geom_line</w:t>
+      </w:r>
+      <w:r>
+        <w:rPr>
+          <w:rStyle w:val="NormalTok"/>
+        </w:rPr>
+        <w:t xml:space="preserve">()</w:t>
+      </w:r>
+      <w:r>
+        <w:rPr>
+          <w:rStyle w:val="SpecialCharTok"/>
+        </w:rPr>
+        <w:t xml:space="preserve">+</w:t>
+      </w:r>
+      <w:r>
+        <w:br/>
+      </w:r>
+      <w:r>
+        <w:rPr>
+          <w:rStyle w:val="NormalTok"/>
+        </w:rPr>
+        <w:t xml:space="preserve">  </w:t>
+      </w:r>
+      <w:r>
+        <w:rPr>
+          <w:rStyle w:val="FunctionTok"/>
+        </w:rPr>
+        <w:t xml:space="preserve">geom_errorbar</w:t>
+      </w:r>
+      <w:r>
+        <w:rPr>
+          <w:rStyle w:val="NormalTok"/>
+        </w:rPr>
+        <w:t xml:space="preserve">(</w:t>
+      </w:r>
+      <w:r>
+        <w:rPr>
+          <w:rStyle w:val="FunctionTok"/>
+        </w:rPr>
+        <w:t xml:space="preserve">aes</w:t>
+      </w:r>
+      <w:r>
+        <w:rPr>
+          <w:rStyle w:val="NormalTok"/>
+        </w:rPr>
+        <w:t xml:space="preserve">(</w:t>
+      </w:r>
+      <w:r>
+        <w:rPr>
+          <w:rStyle w:val="AttributeTok"/>
+        </w:rPr>
+        <w:t xml:space="preserve">ymin=</w:t>
+      </w:r>
+      <w:r>
+        <w:rPr>
+          <w:rStyle w:val="NormalTok"/>
+        </w:rPr>
+        <w:t xml:space="preserve">c_mean</w:t>
+      </w:r>
+      <w:r>
+        <w:rPr>
+          <w:rStyle w:val="SpecialCharTok"/>
+        </w:rPr>
+        <w:t xml:space="preserve">-</w:t>
+      </w:r>
+      <w:r>
+        <w:rPr>
+          <w:rStyle w:val="NormalTok"/>
+        </w:rPr>
+        <w:t xml:space="preserve">c_sd, </w:t>
+      </w:r>
+      <w:r>
+        <w:rPr>
+          <w:rStyle w:val="AttributeTok"/>
+        </w:rPr>
+        <w:t xml:space="preserve">ymax =</w:t>
+      </w:r>
+      <w:r>
+        <w:rPr>
+          <w:rStyle w:val="NormalTok"/>
+        </w:rPr>
+        <w:t xml:space="preserve"> c_mean</w:t>
+      </w:r>
+      <w:r>
+        <w:rPr>
+          <w:rStyle w:val="SpecialCharTok"/>
+        </w:rPr>
+        <w:t xml:space="preserve">+</w:t>
+      </w:r>
+      <w:r>
+        <w:rPr>
+          <w:rStyle w:val="NormalTok"/>
+        </w:rPr>
+        <w:t xml:space="preserve">c_sd))</w:t>
+      </w:r>
+      <w:r>
+        <w:rPr>
+          <w:rStyle w:val="SpecialCharTok"/>
+        </w:rPr>
+        <w:t xml:space="preserve">+</w:t>
+      </w:r>
+      <w:r>
+        <w:br/>
+      </w:r>
+      <w:r>
+        <w:rPr>
+          <w:rStyle w:val="NormalTok"/>
+        </w:rPr>
+        <w:t xml:space="preserve">  </w:t>
+      </w:r>
+      <w:r>
+        <w:rPr>
+          <w:rStyle w:val="FunctionTok"/>
+        </w:rPr>
+        <w:t xml:space="preserve">theme_linedraw</w:t>
+      </w:r>
+      <w:r>
+        <w:rPr>
+          <w:rStyle w:val="NormalTok"/>
+        </w:rPr>
+        <w:t xml:space="preserve">(</w:t>
+      </w:r>
+      <w:r>
+        <w:rPr>
+          <w:rStyle w:val="AttributeTok"/>
+        </w:rPr>
+        <w:t xml:space="preserve">base_size=</w:t>
+      </w:r>
+      <w:r>
+        <w:rPr>
+          <w:rStyle w:val="DecValTok"/>
+        </w:rPr>
+        <w:t xml:space="preserve">12</w:t>
+      </w:r>
+      <w:r>
+        <w:rPr>
+          <w:rStyle w:val="NormalTok"/>
+        </w:rPr>
+        <w:t xml:space="preserve">)</w:t>
+      </w:r>
+      <w:r>
+        <w:rPr>
+          <w:rStyle w:val="SpecialCharTok"/>
+        </w:rPr>
+        <w:t xml:space="preserve">+</w:t>
+      </w:r>
+      <w:r>
+        <w:br/>
+      </w:r>
+      <w:r>
+        <w:rPr>
+          <w:rStyle w:val="NormalTok"/>
+        </w:rPr>
+        <w:t xml:space="preserve">  </w:t>
+      </w:r>
+      <w:r>
+        <w:rPr>
+          <w:rStyle w:val="FunctionTok"/>
+        </w:rPr>
+        <w:t xml:space="preserve">theme</w:t>
+      </w:r>
+      <w:r>
+        <w:rPr>
+          <w:rStyle w:val="NormalTok"/>
+        </w:rPr>
+        <w:t xml:space="preserve">(</w:t>
+      </w:r>
+      <w:r>
+        <w:rPr>
+          <w:rStyle w:val="AttributeTok"/>
+        </w:rPr>
+        <w:t xml:space="preserve">strip.background =</w:t>
+      </w:r>
+      <w:r>
+        <w:rPr>
+          <w:rStyle w:val="NormalTok"/>
+        </w:rPr>
+        <w:t xml:space="preserve"> </w:t>
+      </w:r>
+      <w:r>
+        <w:rPr>
+          <w:rStyle w:val="FunctionTok"/>
+        </w:rPr>
+        <w:t xml:space="preserve">element_rect</w:t>
+      </w:r>
+      <w:r>
+        <w:rPr>
+          <w:rStyle w:val="NormalTok"/>
+        </w:rPr>
+        <w:t xml:space="preserve">(</w:t>
+      </w:r>
+      <w:r>
+        <w:rPr>
+          <w:rStyle w:val="AttributeTok"/>
+        </w:rPr>
+        <w:t xml:space="preserve">fill=</w:t>
+      </w:r>
+      <w:r>
+        <w:rPr>
+          <w:rStyle w:val="StringTok"/>
+        </w:rPr>
+        <w:t xml:space="preserve">"white"</w:t>
+      </w:r>
+      <w:r>
+        <w:rPr>
+          <w:rStyle w:val="NormalTok"/>
+        </w:rPr>
+        <w:t xml:space="preserve">,</w:t>
+      </w:r>
+      <w:r>
+        <w:rPr>
+          <w:rStyle w:val="AttributeTok"/>
+        </w:rPr>
+        <w:t xml:space="preserve">color=</w:t>
+      </w:r>
+      <w:r>
+        <w:rPr>
+          <w:rStyle w:val="ConstantTok"/>
+        </w:rPr>
+        <w:t xml:space="preserve">NA</w:t>
+      </w:r>
+      <w:r>
+        <w:rPr>
+          <w:rStyle w:val="NormalTok"/>
+        </w:rPr>
+        <w:t xml:space="preserve">),</w:t>
+      </w:r>
+      <w:r>
+        <w:br/>
+      </w:r>
+      <w:r>
+        <w:rPr>
+          <w:rStyle w:val="NormalTok"/>
+        </w:rPr>
+        <w:t xml:space="preserve">        </w:t>
+      </w:r>
+      <w:r>
+        <w:rPr>
+          <w:rStyle w:val="AttributeTok"/>
+        </w:rPr>
+        <w:t xml:space="preserve">strip.text =</w:t>
+      </w:r>
+      <w:r>
+        <w:rPr>
+          <w:rStyle w:val="NormalTok"/>
+        </w:rPr>
+        <w:t xml:space="preserve"> </w:t>
+      </w:r>
+      <w:r>
+        <w:rPr>
+          <w:rStyle w:val="FunctionTok"/>
+        </w:rPr>
+        <w:t xml:space="preserve">element_text</w:t>
+      </w:r>
+      <w:r>
+        <w:rPr>
+          <w:rStyle w:val="NormalTok"/>
+        </w:rPr>
+        <w:t xml:space="preserve">(</w:t>
+      </w:r>
+      <w:r>
+        <w:rPr>
+          <w:rStyle w:val="AttributeTok"/>
+        </w:rPr>
+        <w:t xml:space="preserve">color=</w:t>
+      </w:r>
+      <w:r>
+        <w:rPr>
+          <w:rStyle w:val="StringTok"/>
+        </w:rPr>
+        <w:t xml:space="preserve">"black"</w:t>
+      </w:r>
+      <w:r>
+        <w:rPr>
+          <w:rStyle w:val="NormalTok"/>
+        </w:rPr>
+        <w:t xml:space="preserve">,</w:t>
+      </w:r>
+      <w:r>
+        <w:rPr>
+          <w:rStyle w:val="AttributeTok"/>
+        </w:rPr>
+        <w:t xml:space="preserve">size=</w:t>
+      </w:r>
+      <w:r>
+        <w:rPr>
+          <w:rStyle w:val="DecValTok"/>
+        </w:rPr>
+        <w:t xml:space="preserve">12</w:t>
+      </w:r>
+      <w:r>
+        <w:rPr>
+          <w:rStyle w:val="NormalTok"/>
+        </w:rPr>
+        <w:t xml:space="preserve">),</w:t>
+      </w:r>
+      <w:r>
+        <w:br/>
+      </w:r>
+      <w:r>
+        <w:rPr>
+          <w:rStyle w:val="NormalTok"/>
+        </w:rPr>
+        <w:t xml:space="preserve">        </w:t>
+      </w:r>
+      <w:r>
+        <w:rPr>
+          <w:rStyle w:val="AttributeTok"/>
+        </w:rPr>
+        <w:t xml:space="preserve">axis.text =</w:t>
+      </w:r>
+      <w:r>
+        <w:rPr>
+          <w:rStyle w:val="NormalTok"/>
+        </w:rPr>
+        <w:t xml:space="preserve"> </w:t>
+      </w:r>
+      <w:r>
+        <w:rPr>
+          <w:rStyle w:val="FunctionTok"/>
+        </w:rPr>
+        <w:t xml:space="preserve">element_text</w:t>
+      </w:r>
+      <w:r>
+        <w:rPr>
+          <w:rStyle w:val="NormalTok"/>
+        </w:rPr>
+        <w:t xml:space="preserve">(</w:t>
+      </w:r>
+      <w:r>
+        <w:rPr>
+          <w:rStyle w:val="AttributeTok"/>
+        </w:rPr>
+        <w:t xml:space="preserve">size=</w:t>
+      </w:r>
+      <w:r>
+        <w:rPr>
+          <w:rStyle w:val="DecValTok"/>
+        </w:rPr>
+        <w:t xml:space="preserve">11</w:t>
+      </w:r>
+      <w:r>
+        <w:rPr>
+          <w:rStyle w:val="NormalTok"/>
+        </w:rPr>
+        <w:t xml:space="preserve">))</w:t>
+      </w:r>
+      <w:r>
+        <w:rPr>
+          <w:rStyle w:val="SpecialCharTok"/>
+        </w:rPr>
+        <w:t xml:space="preserve">+</w:t>
+      </w:r>
+      <w:r>
+        <w:br/>
+      </w:r>
+      <w:r>
+        <w:rPr>
+          <w:rStyle w:val="NormalTok"/>
+        </w:rPr>
+        <w:t xml:space="preserve">  </w:t>
+      </w:r>
+      <w:r>
+        <w:rPr>
+          <w:rStyle w:val="FunctionTok"/>
+        </w:rPr>
+        <w:t xml:space="preserve">facet_wrap</w:t>
+      </w:r>
+      <w:r>
+        <w:rPr>
+          <w:rStyle w:val="NormalTok"/>
+        </w:rPr>
+        <w:t xml:space="preserve">(</w:t>
+      </w:r>
+      <w:r>
+        <w:rPr>
+          <w:rStyle w:val="SpecialCharTok"/>
+        </w:rPr>
+        <w:t xml:space="preserve">~</w:t>
+      </w:r>
+      <w:r>
+        <w:rPr>
+          <w:rStyle w:val="NormalTok"/>
+        </w:rPr>
+        <w:t xml:space="preserve">k_lab)</w:t>
+      </w:r>
+      <w:r>
+        <w:rPr>
+          <w:rStyle w:val="SpecialCharTok"/>
+        </w:rPr>
+        <w:t xml:space="preserve">+</w:t>
+      </w:r>
+      <w:r>
+        <w:br/>
+      </w:r>
+      <w:r>
+        <w:rPr>
+          <w:rStyle w:val="NormalTok"/>
+        </w:rPr>
+        <w:t xml:space="preserve">  </w:t>
+      </w:r>
+      <w:r>
+        <w:rPr>
+          <w:rStyle w:val="FunctionTok"/>
+        </w:rPr>
+        <w:t xml:space="preserve">labs</w:t>
+      </w:r>
+      <w:r>
+        <w:rPr>
+          <w:rStyle w:val="NormalTok"/>
+        </w:rPr>
+        <w:t xml:space="preserve">(</w:t>
+      </w:r>
+      <w:r>
+        <w:rPr>
+          <w:rStyle w:val="AttributeTok"/>
+        </w:rPr>
+        <w:t xml:space="preserve">y=</w:t>
+      </w:r>
+      <w:r>
+        <w:rPr>
+          <w:rStyle w:val="StringTok"/>
+        </w:rPr>
+        <w:t xml:space="preserve">"CV C-index"</w:t>
+      </w:r>
+      <w:r>
+        <w:rPr>
+          <w:rStyle w:val="NormalTok"/>
+        </w:rPr>
+        <w:t xml:space="preserve">)</w:t>
+      </w:r>
+      <w:r>
+        <w:br/>
+      </w:r>
+      <w:r>
+        <w:br/>
+      </w:r>
+      <w:r>
+        <w:rPr>
+          <w:rStyle w:val="NormalTok"/>
+        </w:rPr>
+        <w:t xml:space="preserve">ggpubr</w:t>
+      </w:r>
+      <w:r>
+        <w:rPr>
+          <w:rStyle w:val="SpecialCharTok"/>
+        </w:rPr>
+        <w:t xml:space="preserve">::</w:t>
+      </w:r>
+      <w:r>
+        <w:rPr>
+          <w:rStyle w:val="FunctionTok"/>
+        </w:rPr>
+        <w:t xml:space="preserve">ggarrange</w:t>
+      </w:r>
+      <w:r>
+        <w:rPr>
+          <w:rStyle w:val="NormalTok"/>
+        </w:rPr>
+        <w:t xml:space="preserve">(heat,panels,</w:t>
+      </w:r>
+      <w:r>
+        <w:rPr>
+          <w:rStyle w:val="AttributeTok"/>
+        </w:rPr>
+        <w:t xml:space="preserve">ncol=</w:t>
+      </w:r>
+      <w:r>
+        <w:rPr>
+          <w:rStyle w:val="DecValTok"/>
+        </w:rPr>
+        <w:t xml:space="preserve">2</w:t>
+      </w:r>
+      <w:r>
+        <w:rPr>
+          <w:rStyle w:val="NormalTok"/>
+        </w:rPr>
+        <w:t xml:space="preserve">,</w:t>
+      </w:r>
+      <w:r>
+        <w:rPr>
+          <w:rStyle w:val="AttributeTok"/>
+        </w:rPr>
+        <w:t xml:space="preserve">nrow=</w:t>
+      </w:r>
+      <w:r>
+        <w:rPr>
+          <w:rStyle w:val="DecValTok"/>
+        </w:rPr>
+        <w:t xml:space="preserve">1</w:t>
+      </w:r>
+      <w:r>
+        <w:rPr>
+          <w:rStyle w:val="NormalTok"/>
+        </w:rPr>
+        <w:t xml:space="preserve">,</w:t>
+      </w:r>
+      <w:r>
+        <w:rPr>
+          <w:rStyle w:val="AttributeTok"/>
+        </w:rPr>
+        <w:t xml:space="preserve">labels=</w:t>
+      </w:r>
+      <w:r>
+        <w:rPr>
+          <w:rStyle w:val="FunctionTok"/>
+        </w:rPr>
+        <w:t xml:space="preserve">c</w:t>
+      </w:r>
+      <w:r>
+        <w:rPr>
+          <w:rStyle w:val="NormalTok"/>
+        </w:rPr>
+        <w:t xml:space="preserve">(</w:t>
+      </w:r>
+      <w:r>
+        <w:rPr>
+          <w:rStyle w:val="StringTok"/>
+        </w:rPr>
+        <w:t xml:space="preserve">"A"</w:t>
+      </w:r>
+      <w:r>
+        <w:rPr>
+          <w:rStyle w:val="NormalTok"/>
+        </w:rPr>
+        <w:t xml:space="preserve">,</w:t>
+      </w:r>
+      <w:r>
+        <w:rPr>
+          <w:rStyle w:val="StringTok"/>
+        </w:rPr>
+        <w:t xml:space="preserve">"B"</w:t>
+      </w:r>
+      <w:r>
+        <w:rPr>
+          <w:rStyle w:val="NormalTok"/>
+        </w:rPr>
+        <w:t xml:space="preserve">),</w:t>
+      </w:r>
+      <w:r>
+        <w:rPr>
+          <w:rStyle w:val="AttributeTok"/>
+        </w:rPr>
+        <w:t xml:space="preserve">widths=</w:t>
+      </w:r>
+      <w:r>
+        <w:rPr>
+          <w:rStyle w:val="FunctionTok"/>
+        </w:rPr>
+        <w:t xml:space="preserve">c</w:t>
+      </w:r>
+      <w:r>
+        <w:rPr>
+          <w:rStyle w:val="NormalTok"/>
+        </w:rPr>
+        <w:t xml:space="preserve">(</w:t>
+      </w:r>
+      <w:r>
+        <w:rPr>
+          <w:rStyle w:val="DecValTok"/>
+        </w:rPr>
+        <w:t xml:space="preserve">5</w:t>
+      </w:r>
+      <w:r>
+        <w:rPr>
+          <w:rStyle w:val="NormalTok"/>
+        </w:rPr>
+        <w:t xml:space="preserve">,</w:t>
+      </w:r>
+      <w:r>
+        <w:rPr>
+          <w:rStyle w:val="DecValTok"/>
+        </w:rPr>
+        <w:t xml:space="preserve">4</w:t>
+      </w:r>
+      <w:r>
+        <w:rPr>
+          <w:rStyle w:val="NormalTok"/>
+        </w:rPr>
+        <w:t xml:space="preserve">))</w:t>
+      </w:r>
     </w:p>
     <w:p>
       <w:pPr>
-        <w:pStyle w:val="BodyText"/>
-      </w:pPr>
-      <w:r>
-        <w:t xml:space="preserve">These updates are alternated until convergence to a stationary point.</w:t>
+        <w:pStyle w:val="FirstParagraph"/>
+      </w:pPr>
+      <w:r>
+        <w:drawing>
+          <wp:inline>
+            <wp:extent cx="4620126" cy="3696101"/>
+            <wp:effectExtent b="0" l="0" r="0" t="0"/>
+            <wp:docPr descr="" title="" id="26" name="Picture"/>
+            <a:graphic>
+              <a:graphicData uri="http://schemas.openxmlformats.org/drawingml/2006/picture">
+                <pic:pic>
+                  <pic:nvPicPr>
+                    <pic:cNvPr descr="/work/users/a/y/ayoung31/DeSurv-paper/paper/paper_edits_files/figure-docx/fig-cv-1.png" id="27" name="Picture"/>
+                    <pic:cNvPicPr>
+                      <a:picLocks noChangeArrowheads="1" noChangeAspect="1"/>
+                    </pic:cNvPicPr>
+                  </pic:nvPicPr>
+                  <pic:blipFill>
+                    <a:blip r:embed="rId25"/>
+                    <a:stretch>
+                      <a:fillRect/>
+                    </a:stretch>
+                  </pic:blipFill>
+                  <pic:spPr bwMode="auto">
+                    <a:xfrm>
+                      <a:off x="0" y="0"/>
+                      <a:ext cx="4620126" cy="3696101"/>
+                    </a:xfrm>
+                    <a:prstGeom prst="rect">
+                      <a:avLst/>
+                    </a:prstGeom>
+                    <a:noFill/>
+                    <a:ln w="9525">
+                      <a:noFill/>
+                      <a:headEnd/>
+                      <a:tailEnd/>
+                    </a:ln>
+                  </pic:spPr>
+                </pic:pic>
+              </a:graphicData>
+            </a:graphic>
+          </wp:inline>
+        </w:drawing>
       </w:r>
     </w:p>
-    <w:bookmarkEnd w:id="26"/>
-    <w:bookmarkStart w:id="27" w:name="proportional-hazards"/>
+    <w:bookmarkEnd w:id="28"/>
+    <w:bookmarkStart w:id="29" w:name="Xc1263e1b63fa6ccef832b703f3d5a3280cd394a"/>
     <w:p>
       <w:pPr>
         <w:pStyle w:val="Heading2"/>
       </w:pPr>
       <w:r>
-        <w:t xml:space="preserve">Proportional Hazards</w:t>
+        <w:t xml:space="preserve">NMF–Cox uncovers biologically interpretable latent factors associated with clinical outcomes</w:t>
       </w:r>
     </w:p>
     <w:p>
@@ -452,21 +2965,12 @@
         <w:pStyle w:val="FirstParagraph"/>
       </w:pPr>
       <w:r>
-        <w:t xml:space="preserve">To determine how the lower dimensional representation of X is associated with patient survival outcomes, we take</w:t>
+        <w:t xml:space="preserve">Despite limited performance gains from supervision, the latent factors identified by NMF–Cox exhibited strong biological interpretability. The projected covariates,</w:t>
       </w:r>
       <w:r>
         <w:t xml:space="preserve"> </w:t>
       </w:r>
       <m:oMath>
-        <m:r>
-          <m:t>Z</m:t>
-        </m:r>
-        <m:r>
-          <m:rPr>
-            <m:sty m:val="p"/>
-          </m:rPr>
-          <m:t>=</m:t>
-        </m:r>
         <m:sSup>
           <m:e>
             <m:r>
@@ -484,94 +2988,251 @@
         </m:r>
       </m:oMath>
       <w:r>
-        <w:t xml:space="preserve"> </w:t>
-      </w:r>
-      <w:r>
-        <w:t xml:space="preserve">to be the covariates passed to the proportional hazards model. The matrix</w:t>
-      </w:r>
-      <w:r>
-        <w:t xml:space="preserve"> </w:t>
+        <w:t xml:space="preserve">, aligned with known clinical and molecular subtypes, including basal-like versus classical subgroups in pancreatic cancer (Figure 7). Kaplan–Meier curves stratified by factor exposures revealed significant survival differences (Figure 8), supporting the prognostic relevance of the factors. At the gene level, W highlighted pathway-level enrichment for immune signaling, stromal activity, and hallmark oncogenic processes. Overlap analysis (Figure 9) demonstrated consistency with external signatures, confirming that NMF–Cox produces reproducible biological features.</w:t>
+      </w:r>
+    </w:p>
+    <w:bookmarkEnd w:id="29"/>
+    <w:bookmarkStart w:id="30" w:name="X16c4f0ecd5312e113213c382456a4adae5002e6"/>
+    <w:p>
+      <w:pPr>
+        <w:pStyle w:val="Heading2"/>
+      </w:pPr>
+      <w:r>
+        <w:t xml:space="preserve">NMF–Cox factors generalize to independent cohorts in external validation</w:t>
+      </w:r>
+    </w:p>
+    <w:p>
+      <w:pPr>
+        <w:pStyle w:val="FirstParagraph"/>
+      </w:pPr>
+      <w:r>
+        <w:t xml:space="preserve">To assess generalizability, models trained on TCGA-PAAD and CPTAC were applied to external cohorts including PACA, Moffitt, and Puleo. Factor exposures in validation datasets recapitulated subgroup structures identified in training and stratified patients into groups with distinct survival outcomes (Figure 10). Factor correlation analyses (Figure 11) confirmed reproducibility of core latent dimensions, particularly those separating basal-like and classical subtypes. Predictive accuracy in external cohorts was comparable to cross-validation results, with simpler models (</w:t>
       </w:r>
       <m:oMath>
         <m:r>
-          <m:t>Z</m:t>
+          <m:t>k</m:t>
+        </m:r>
+        <m:r>
+          <m:rPr>
+            <m:sty m:val="p"/>
+          </m:rPr>
+          <m:t>≤</m:t>
+        </m:r>
+        <m:r>
+          <m:t>5</m:t>
         </m:r>
       </m:oMath>
       <w:r>
-        <w:t xml:space="preserve"> </w:t>
-      </w:r>
-      <w:r>
-        <w:t xml:space="preserve">can be interpreted as the transformation of the data matrix</w:t>
+        <w:t xml:space="preserve">) showing greater reproducibility. These findings indicate that NMF–Cox captures transferable biological signals across studies.</w:t>
+      </w:r>
+    </w:p>
+    <w:bookmarkEnd w:id="30"/>
+    <w:bookmarkEnd w:id="31"/>
+    <w:bookmarkStart w:id="38" w:name="materials-and-methods"/>
+    <w:p>
+      <w:pPr>
+        <w:pStyle w:val="Heading1"/>
+      </w:pPr>
+      <w:r>
+        <w:t xml:space="preserve">Materials and methods</w:t>
+      </w:r>
+    </w:p>
+    <w:bookmarkStart w:id="34" w:name="joint-loss-function"/>
+    <w:p>
+      <w:pPr>
+        <w:pStyle w:val="Heading2"/>
+      </w:pPr>
+      <w:r>
+        <w:t xml:space="preserve">Joint loss function</w:t>
+      </w:r>
+    </w:p>
+    <w:p>
+      <w:pPr>
+        <w:pStyle w:val="FirstParagraph"/>
+      </w:pPr>
+      <w:r>
+        <w:t xml:space="preserve">DeSurv is constructs a joint loss function of NMF reconstruction error and the cox partial likelihood. The contribution of each component to the overall loss is weighted by hyperparameter</w:t>
       </w:r>
       <w:r>
         <w:t xml:space="preserve"> </w:t>
       </w:r>
       <m:oMath>
         <m:r>
-          <m:t>X</m:t>
+          <m:t>α</m:t>
         </m:r>
       </m:oMath>
       <w:r>
-        <w:t xml:space="preserve"> </w:t>
-      </w:r>
-      <w:r>
-        <w:t xml:space="preserve">into the lower dimensional space, such that</w:t>
+        <w:t xml:space="preserve">.</w:t>
+      </w:r>
+    </w:p>
+    <w:p>
+      <w:pPr>
+        <w:pStyle w:val="BodyText"/>
+      </w:pPr>
+    </w:p>
+    <w:bookmarkStart w:id="32" w:name="reconstruction-error"/>
+    <w:p>
+      <w:pPr>
+        <w:pStyle w:val="Heading3"/>
+      </w:pPr>
+      <w:r>
+        <w:t xml:space="preserve">Reconstruction error</w:t>
+      </w:r>
+    </w:p>
+    <w:p>
+      <w:pPr>
+        <w:pStyle w:val="FirstParagraph"/>
+      </w:pPr>
+      <w:r>
+        <w:t xml:space="preserve">Let X be a matrix of</w:t>
       </w:r>
       <w:r>
         <w:t xml:space="preserve"> </w:t>
       </w:r>
       <m:oMath>
-        <m:sSub>
+        <m:r>
+          <m:t>p</m:t>
+        </m:r>
+      </m:oMath>
+      <w:r>
+        <w:t xml:space="preserve"> </w:t>
+      </w:r>
+      <w:r>
+        <w:t xml:space="preserve">features and</w:t>
+      </w:r>
+      <w:r>
+        <w:t xml:space="preserve"> </w:t>
+      </w:r>
+      <m:oMath>
+        <m:r>
+          <m:t>n</m:t>
+        </m:r>
+      </m:oMath>
+      <w:r>
+        <w:t xml:space="preserve"> </w:t>
+      </w:r>
+      <w:r>
+        <w:t xml:space="preserve">subjects. Then the NMF portion of the loss is</w:t>
+      </w:r>
+      <w:r>
+        <w:t xml:space="preserve"> </w:t>
+      </w:r>
+      <w:r>
+        <w:t xml:space="preserve"> </w:t>
+      </w:r>
+      <w:r>
+        <w:t xml:space="preserve">where</w:t>
+      </w:r>
+      <w:r>
+        <w:t xml:space="preserve"> </w:t>
+      </w:r>
+      <m:oMath>
+        <m:r>
+          <m:t>W</m:t>
+        </m:r>
+        <m:r>
+          <m:rPr>
+            <m:sty m:val="p"/>
+          </m:rPr>
+          <m:t>∈</m:t>
+        </m:r>
+        <m:sSup>
           <m:e>
             <m:r>
-              <m:t>Z</m:t>
+              <m:t>R</m:t>
             </m:r>
           </m:e>
-          <m:sub>
+          <m:sup>
             <m:r>
-              <m:t>r</m:t>
+              <m:t>p</m:t>
             </m:r>
             <m:r>
-              <m:t>i</m:t>
+              <m:rPr>
+                <m:sty m:val="p"/>
+              </m:rPr>
+              <m:t>×</m:t>
             </m:r>
-          </m:sub>
-        </m:sSub>
+            <m:r>
+              <m:t>k</m:t>
+            </m:r>
+          </m:sup>
+        </m:sSup>
       </m:oMath>
       <w:r>
         <w:t xml:space="preserve"> </w:t>
       </w:r>
       <w:r>
-        <w:t xml:space="preserve">represents a score for the contribution of factor</w:t>
+        <w:t xml:space="preserve">is the matrix of feature weights and</w:t>
       </w:r>
       <w:r>
         <w:t xml:space="preserve"> </w:t>
       </w:r>
       <m:oMath>
         <m:r>
-          <m:t>r</m:t>
-        </m:r>
+          <m:t>H</m:t>
+        </m:r>
+        <m:r>
+          <m:rPr>
+            <m:sty m:val="p"/>
+          </m:rPr>
+          <m:t>∈</m:t>
+        </m:r>
+        <m:sSup>
+          <m:e>
+            <m:r>
+              <m:t>R</m:t>
+            </m:r>
+          </m:e>
+          <m:sup>
+            <m:r>
+              <m:t>k</m:t>
+            </m:r>
+            <m:r>
+              <m:rPr>
+                <m:sty m:val="p"/>
+              </m:rPr>
+              <m:t>×</m:t>
+            </m:r>
+            <m:r>
+              <m:t>n</m:t>
+            </m:r>
+          </m:sup>
+        </m:sSup>
       </m:oMath>
       <w:r>
         <w:t xml:space="preserve"> </w:t>
       </w:r>
       <w:r>
-        <w:t xml:space="preserve">to subject</w:t>
+        <w:t xml:space="preserve">is the matrix of subject weights, where</w:t>
       </w:r>
       <w:r>
         <w:t xml:space="preserve"> </w:t>
       </w:r>
       <m:oMath>
         <m:r>
-          <m:t>i</m:t>
+          <m:t>k</m:t>
         </m:r>
       </m:oMath>
       <w:r>
-        <w:t xml:space="preserve">.</w:t>
+        <w:t xml:space="preserve"> </w:t>
+      </w:r>
+      <w:r>
+        <w:t xml:space="preserve">represents the number of latent factors.</w:t>
+      </w:r>
+    </w:p>
+    <w:bookmarkEnd w:id="32"/>
+    <w:bookmarkStart w:id="33" w:name="cox-partial-likelihood"/>
+    <w:p>
+      <w:pPr>
+        <w:pStyle w:val="Heading3"/>
+      </w:pPr>
+      <w:r>
+        <w:t xml:space="preserve">Cox partial likelihood</w:t>
       </w:r>
     </w:p>
     <w:p>
       <w:pPr>
-        <w:pStyle w:val="BodyText"/>
+        <w:pStyle w:val="FirstParagraph"/>
       </w:pPr>
       <w:r>
         <w:t xml:space="preserve">Let</w:t>
@@ -740,475 +3401,274 @@
         </m:r>
       </m:oMath>
       <w:r>
-        <w:t xml:space="preserve">th subject is observed. The the log partial likelihood is</w:t>
-      </w:r>
-    </w:p>
-    <w:p>
-      <w:pPr>
-        <w:pStyle w:val="BodyText"/>
-      </w:pPr>
-    </w:p>
-    <w:bookmarkEnd w:id="27"/>
-    <w:bookmarkStart w:id="28" w:name="desurv"/>
-    <w:p>
-      <w:pPr>
-        <w:pStyle w:val="Heading2"/>
-      </w:pPr>
-      <w:r>
-        <w:t xml:space="preserve">DeSurv</w:t>
-      </w:r>
-    </w:p>
-    <w:p>
-      <w:pPr>
-        <w:pStyle w:val="FirstParagraph"/>
-      </w:pPr>
-      <w:r>
-        <w:t xml:space="preserve">DeSurv is a semi-supervised extension of NMF that incorporates the cox proportional hazards directly into the NMF model to encourage the discovered factors to be associated with patient survival. We propose the following loss function</w:t>
-      </w:r>
-    </w:p>
-    <w:p>
-      <w:pPr>
-        <w:pStyle w:val="BodyText"/>
-      </w:pPr>
-    </w:p>
-    <w:p>
-      <w:pPr>
-        <w:pStyle w:val="BodyText"/>
-      </w:pPr>
-      <w:r>
-        <w:t xml:space="preserve">where</w:t>
+        <w:t xml:space="preserve">th subject is observed. Since</w:t>
       </w:r>
       <w:r>
         <w:t xml:space="preserve"> </w:t>
       </w:r>
       <m:oMath>
         <m:r>
-          <m:t>α</m:t>
+          <m:t>W</m:t>
         </m:r>
       </m:oMath>
       <w:r>
         <w:t xml:space="preserve"> </w:t>
       </w:r>
       <w:r>
-        <w:t xml:space="preserve">is the hyperparameter that balances the contribution of the NMF and proportional hazards model to the overall loss. Penalty terms</w:t>
+        <w:t xml:space="preserve">is not dataset dependent, we take</w:t>
       </w:r>
       <w:r>
         <w:t xml:space="preserve"> </w:t>
       </w:r>
       <m:oMath>
-        <m:d>
-          <m:dPr>
-            <m:begChr m:val="|"/>
-            <m:endChr m:val="|"/>
-            <m:sepChr m:val=""/>
-            <m:grow/>
-          </m:dPr>
-          <m:e/>
-        </m:d>
-        <m:r>
-          <m:t>W</m:t>
-        </m:r>
-        <m:sSubSup>
+        <m:r>
+          <m:t>Z</m:t>
+        </m:r>
+        <m:r>
+          <m:rPr>
+            <m:sty m:val="p"/>
+          </m:rPr>
+          <m:t>=</m:t>
+        </m:r>
+        <m:sSup>
           <m:e>
-            <m:d>
-              <m:dPr>
-                <m:begChr m:val="|"/>
-                <m:endChr m:val="|"/>
-                <m:sepChr m:val=""/>
-                <m:grow/>
-              </m:dPr>
-              <m:e/>
-            </m:d>
+            <m:r>
+              <m:t>X</m:t>
+            </m:r>
           </m:e>
-          <m:sub>
-            <m:r>
-              <m:t>F</m:t>
-            </m:r>
-          </m:sub>
           <m:sup>
             <m:r>
-              <m:t>2</m:t>
+              <m:t>T</m:t>
             </m:r>
           </m:sup>
-        </m:sSubSup>
-      </m:oMath>
-      <w:r>
-        <w:t xml:space="preserve">, and</w:t>
-      </w:r>
-      <w:r>
-        <w:t xml:space="preserve"> </w:t>
-      </w:r>
-      <m:oMath>
-        <m:d>
-          <m:dPr>
-            <m:begChr m:val="|"/>
-            <m:endChr m:val="|"/>
-            <m:sepChr m:val=""/>
-            <m:grow/>
-          </m:dPr>
-          <m:e/>
-        </m:d>
-        <m:r>
-          <m:t>H</m:t>
-        </m:r>
-        <m:sSubSup>
+        </m:sSup>
+        <m:r>
+          <m:t>W</m:t>
+        </m:r>
+        <m:r>
+          <m:rPr>
+            <m:sty m:val="p"/>
+          </m:rPr>
+          <m:t>∈</m:t>
+        </m:r>
+        <m:sSup>
           <m:e>
-            <m:d>
-              <m:dPr>
-                <m:begChr m:val="|"/>
-                <m:endChr m:val="|"/>
-                <m:sepChr m:val=""/>
-                <m:grow/>
-              </m:dPr>
-              <m:e/>
-            </m:d>
+            <m:r>
+              <m:t>R</m:t>
+            </m:r>
           </m:e>
-          <m:sub>
-            <m:r>
-              <m:t>F</m:t>
-            </m:r>
-          </m:sub>
           <m:sup>
             <m:r>
-              <m:t>2</m:t>
-            </m:r>
-          </m:sup>
-        </m:sSubSup>
-      </m:oMath>
-      <w:r>
-        <w:t xml:space="preserve"> </w:t>
-      </w:r>
-      <w:r>
-        <w:t xml:space="preserve">provide additional stability for the model. We take</w:t>
-      </w:r>
-    </w:p>
-    <w:p>
-      <w:pPr>
-        <w:pStyle w:val="BodyText"/>
-      </w:pPr>
-    </w:p>
-    <w:p>
-      <w:pPr>
-        <w:pStyle w:val="BodyText"/>
-      </w:pPr>
-      <w:r>
-        <w:t xml:space="preserve">to be an elastic net penalty on the regression coefficients</w:t>
-      </w:r>
-      <w:r>
-        <w:t xml:space="preserve"> </w:t>
-      </w:r>
-      <m:oMath>
-        <m:r>
-          <m:t>β</m:t>
-        </m:r>
-      </m:oMath>
-      <w:r>
-        <w:t xml:space="preserve">. The L1 component allows factors that are not associated with survival to be shrunk out of the proportional hazards model, while still contributing to the reconstruction of</w:t>
-      </w:r>
-      <w:r>
-        <w:t xml:space="preserve"> </w:t>
-      </w:r>
-      <m:oMath>
-        <m:r>
-          <m:t>X</m:t>
-        </m:r>
-      </m:oMath>
-      <w:r>
-        <w:t xml:space="preserve">.</w:t>
-      </w:r>
-    </w:p>
-    <w:bookmarkEnd w:id="28"/>
-    <w:bookmarkStart w:id="29" w:name="update-rules-for-desurv"/>
-    <w:p>
-      <w:pPr>
-        <w:pStyle w:val="Heading2"/>
-      </w:pPr>
-      <w:r>
-        <w:t xml:space="preserve">Update Rules for DeSurv</w:t>
-      </w:r>
-    </w:p>
-    <w:p>
-      <w:pPr>
-        <w:pStyle w:val="FirstParagraph"/>
-      </w:pPr>
-      <w:r>
-        <w:t xml:space="preserve">To solve this loss function, we propose an update scheme that alternates between updating</w:t>
-      </w:r>
-      <w:r>
-        <w:t xml:space="preserve"> </w:t>
-      </w:r>
-      <m:oMath>
-        <m:r>
-          <m:t>W</m:t>
-        </m:r>
-      </m:oMath>
-      <w:r>
-        <w:t xml:space="preserve">,</w:t>
-      </w:r>
-      <w:r>
-        <w:t xml:space="preserve"> </w:t>
-      </w:r>
-      <m:oMath>
-        <m:r>
-          <m:t>H</m:t>
-        </m:r>
-      </m:oMath>
-      <w:r>
-        <w:t xml:space="preserve">, and</w:t>
-      </w:r>
-      <w:r>
-        <w:t xml:space="preserve"> </w:t>
-      </w:r>
-      <m:oMath>
-        <m:r>
-          <m:t>β</m:t>
-        </m:r>
-      </m:oMath>
-      <w:r>
-        <w:t xml:space="preserve"> </w:t>
-      </w:r>
-      <w:r>
-        <w:t xml:space="preserve">until convergence. The algorithm is summarized in Algorithm</w:t>
-      </w:r>
-      <w:r>
-        <w:t xml:space="preserve"> </w:t>
-      </w:r>
-      <w:r>
-        <w:t xml:space="preserve">.</w:t>
-      </w:r>
-    </w:p>
-    <w:bookmarkEnd w:id="29"/>
-    <w:bookmarkStart w:id="30" w:name="update-for-w"/>
-    <w:p>
-      <w:pPr>
-        <w:pStyle w:val="Heading2"/>
-      </w:pPr>
-      <w:r>
-        <w:t xml:space="preserve">Update for</w:t>
-      </w:r>
-      <w:r>
-        <w:t xml:space="preserve"> </w:t>
-      </w:r>
-      <m:oMath>
-        <m:r>
-          <m:t>W</m:t>
-        </m:r>
-      </m:oMath>
-    </w:p>
-    <w:p>
-      <w:pPr>
-        <w:pStyle w:val="FirstParagraph"/>
-      </w:pPr>
-      <w:r>
-        <w:t xml:space="preserve">To get the update rule for</w:t>
-      </w:r>
-      <w:r>
-        <w:t xml:space="preserve"> </w:t>
-      </w:r>
-      <m:oMath>
-        <m:r>
-          <m:t>W</m:t>
-        </m:r>
-      </m:oMath>
-      <w:r>
-        <w:t xml:space="preserve">, we must find</w:t>
-      </w:r>
-    </w:p>
-    <w:p>
-      <w:pPr>
-        <w:pStyle w:val="BodyText"/>
-      </w:pPr>
-    </w:p>
-    <w:p>
-      <w:pPr>
-        <w:pStyle w:val="BodyText"/>
-      </w:pPr>
-      <w:r>
-        <w:t xml:space="preserve">The derivative of the loss with respect to</w:t>
-      </w:r>
-      <w:r>
-        <w:t xml:space="preserve"> </w:t>
-      </w:r>
-      <m:oMath>
-        <m:r>
-          <m:t>W</m:t>
-        </m:r>
-      </m:oMath>
-      <w:r>
-        <w:t xml:space="preserve"> </w:t>
-      </w:r>
-      <w:r>
-        <w:t xml:space="preserve">is</w:t>
-      </w:r>
-    </w:p>
-    <w:p>
-      <w:pPr>
-        <w:pStyle w:val="BodyText"/>
-      </w:pPr>
-    </w:p>
-    <w:p>
-      <w:pPr>
-        <w:pStyle w:val="BodyText"/>
-      </w:pPr>
-      <w:r>
-        <w:t xml:space="preserve">where</w:t>
-      </w:r>
-      <w:r>
-        <w:t xml:space="preserve"> </w:t>
-      </w:r>
-      <m:oMath>
-        <m:f>
-          <m:fPr>
-            <m:type m:val="bar"/>
-          </m:fPr>
-          <m:num>
-            <m:r>
-              <m:rPr>
-                <m:sty m:val="p"/>
-              </m:rPr>
-              <m:t>∂</m:t>
+              <m:t>n</m:t>
             </m:r>
             <m:r>
               <m:rPr>
                 <m:sty m:val="p"/>
               </m:rPr>
-              <m:t>ℓ</m:t>
-            </m:r>
-          </m:num>
-          <m:den>
-            <m:r>
-              <m:rPr>
-                <m:sty m:val="p"/>
-              </m:rPr>
-              <m:t>∂</m:t>
+              <m:t>×</m:t>
             </m:r>
             <m:r>
-              <m:t>W</m:t>
+              <m:t>k</m:t>
             </m:r>
-          </m:den>
-        </m:f>
+          </m:sup>
+        </m:sSup>
       </m:oMath>
       <w:r>
         <w:t xml:space="preserve"> </w:t>
       </w:r>
       <w:r>
-        <w:t xml:space="preserve">is the derivative of the partial likelihood with respect to</w:t>
+        <w:t xml:space="preserve">to be the covariates passed to the proportional hazards model. This can be interpreted as a transformation of the data matrix</w:t>
       </w:r>
       <w:r>
         <w:t xml:space="preserve"> </w:t>
       </w:r>
       <m:oMath>
         <m:r>
-          <m:t>W</m:t>
+          <m:t>X</m:t>
         </m:r>
       </m:oMath>
+      <w:r>
+        <w:t xml:space="preserve"> </w:t>
+      </w:r>
+      <w:r>
+        <w:t xml:space="preserve">into the lower dimensional space. The log partial likelihood is</w:t>
+      </w:r>
     </w:p>
     <w:p>
       <w:pPr>
         <w:pStyle w:val="BodyText"/>
       </w:pPr>
     </w:p>
+    <w:bookmarkEnd w:id="33"/>
+    <w:bookmarkEnd w:id="34"/>
+    <w:bookmarkStart w:id="37" w:name="update-rules"/>
     <w:p>
       <w:pPr>
-        <w:pStyle w:val="BodyText"/>
-      </w:pPr>
-      <w:r>
-        <w:t xml:space="preserve">A multiplicative update for W can then be formed as</w:t>
+        <w:pStyle w:val="Heading2"/>
+      </w:pPr>
+      <w:r>
+        <w:t xml:space="preserve">Update Rules</w:t>
       </w:r>
     </w:p>
     <w:p>
       <w:pPr>
-        <w:pStyle w:val="BodyText"/>
-      </w:pPr>
+        <w:pStyle w:val="FirstParagraph"/>
+      </w:pPr>
+      <w:r>
+        <w:t xml:space="preserve">The joint loss function in (1) is nonconvex. Algorithm (1) provides an update alternates between updating</w:t>
+      </w:r>
+      <w:r>
+        <w:t xml:space="preserve"> </w:t>
+      </w:r>
+      <m:oMath>
+        <m:r>
+          <m:t>W</m:t>
+        </m:r>
+      </m:oMath>
+      <w:r>
+        <w:t xml:space="preserve">,</w:t>
+      </w:r>
+      <w:r>
+        <w:t xml:space="preserve"> </w:t>
+      </w:r>
+      <m:oMath>
+        <m:r>
+          <m:t>H</m:t>
+        </m:r>
+      </m:oMath>
+      <w:r>
+        <w:t xml:space="preserve">, and</w:t>
+      </w:r>
+      <w:r>
+        <w:t xml:space="preserve"> </w:t>
+      </w:r>
+      <m:oMath>
+        <m:r>
+          <m:t>β</m:t>
+        </m:r>
+      </m:oMath>
+      <w:r>
+        <w:t xml:space="preserve"> </w:t>
+      </w:r>
+      <w:r>
+        <w:t xml:space="preserve">until convergence.</w:t>
+      </w:r>
+    </w:p>
+    <w:bookmarkStart w:id="35" w:name="h-update"/>
+    <w:p>
+      <w:pPr>
+        <w:pStyle w:val="Heading3"/>
+      </w:pPr>
+      <w:r>
+        <w:t xml:space="preserve">H update</w:t>
+      </w:r>
     </w:p>
     <w:p>
       <w:pPr>
-        <w:pStyle w:val="BodyText"/>
-      </w:pPr>
-      <w:r>
-        <w:t xml:space="preserve">note that the</w:t>
+        <w:pStyle w:val="FirstParagraph"/>
+      </w:pPr>
+      <w:r>
+        <w:t xml:space="preserve">Since the H update does not depend on</w:t>
       </w:r>
       <w:r>
         <w:t xml:space="preserve"> </w:t>
       </w:r>
       <m:oMath>
         <m:r>
-          <m:rPr>
-            <m:sty m:val="p"/>
-          </m:rPr>
-          <m:t>max</m:t>
-        </m:r>
-        <m:d>
-          <m:dPr>
-            <m:begChr m:val="("/>
-            <m:endChr m:val=")"/>
-            <m:sepChr m:val=""/>
-            <m:grow/>
-          </m:dPr>
-          <m:e>
-            <m:r>
-              <m:rPr>
-                <m:sty m:val="p"/>
-              </m:rPr>
-              <m:t>*</m:t>
-            </m:r>
-            <m:r>
-              <m:rPr>
-                <m:sty m:val="p"/>
-              </m:rPr>
-              <m:t>,</m:t>
-            </m:r>
-            <m:r>
-              <m:t>0</m:t>
-            </m:r>
-          </m:e>
-        </m:d>
+          <m:t>β</m:t>
+        </m:r>
       </m:oMath>
       <w:r>
-        <w:t xml:space="preserve"> </w:t>
-      </w:r>
-      <w:r>
-        <w:t xml:space="preserve">is necessary because the derivative of the partial likelihood is not guaranteed to be nonnegative.</w:t>
+        <w:t xml:space="preserve">, a standard multiplicative update can be used</w:t>
+      </w:r>
+      <w:r>
+        <w:t xml:space="preserve"> </w:t>
       </w:r>
     </w:p>
-    <w:bookmarkEnd w:id="30"/>
-    <w:bookmarkStart w:id="31" w:name="update-for-h"/>
+    <w:bookmarkEnd w:id="35"/>
+    <w:bookmarkStart w:id="36" w:name="beta-update"/>
     <w:p>
       <w:pPr>
-        <w:pStyle w:val="Heading2"/>
-      </w:pPr>
-      <w:r>
-        <w:t xml:space="preserve">Update for</w:t>
-      </w:r>
-      <w:r>
-        <w:t xml:space="preserve"> </w:t>
-      </w:r>
+        <w:pStyle w:val="Heading3"/>
+      </w:pPr>
       <m:oMath>
         <m:r>
-          <m:t>H</m:t>
+          <m:t>β</m:t>
         </m:r>
       </m:oMath>
+      <w:r>
+        <w:t xml:space="preserve"> </w:t>
+      </w:r>
+      <w:r>
+        <w:t xml:space="preserve">update</w:t>
+      </w:r>
     </w:p>
     <w:p>
       <w:pPr>
         <w:pStyle w:val="FirstParagraph"/>
       </w:pPr>
       <w:r>
-        <w:t xml:space="preserve">The update for</w:t>
+        <w:t xml:space="preserve">Holding</w:t>
       </w:r>
       <w:r>
         <w:t xml:space="preserve"> </w:t>
       </w:r>
       <m:oMath>
         <m:r>
-          <m:t>H</m:t>
+          <m:t>W</m:t>
         </m:r>
       </m:oMath>
       <w:r>
         <w:t xml:space="preserve"> </w:t>
       </w:r>
       <w:r>
-        <w:t xml:space="preserve">is a standard NMF multiplicative update.</w:t>
+        <w:t xml:space="preserve">fixed, the</w:t>
+      </w:r>
+      <w:r>
+        <w:t xml:space="preserve"> </w:t>
+      </w:r>
+      <m:oMath>
+        <m:r>
+          <m:t>b</m:t>
+        </m:r>
+        <m:r>
+          <m:t>e</m:t>
+        </m:r>
+        <m:r>
+          <m:t>t</m:t>
+        </m:r>
+        <m:r>
+          <m:t>a</m:t>
+        </m:r>
+      </m:oMath>
+      <w:r>
+        <w:t xml:space="preserve"> </w:t>
+      </w:r>
+      <w:r>
+        <w:t xml:space="preserve">update for covariates</w:t>
+      </w:r>
+      <w:r>
+        <w:t xml:space="preserve"> </w:t>
+      </w:r>
+      <m:oMath>
+        <m:r>
+          <m:t>Z</m:t>
+        </m:r>
+      </m:oMath>
+      <w:r>
+        <w:t xml:space="preserve"> </w:t>
+      </w:r>
+      <w:r>
+        <w:t xml:space="preserve">solves the standard convex penalized weighted least squares problem. The update as derived in</w:t>
+      </w:r>
+      <w:r>
+        <w:t xml:space="preserve"> </w:t>
+      </w:r>
+      <w:r>
+        <w:t xml:space="preserve"> </w:t>
+      </w:r>
+      <w:r>
+        <w:t xml:space="preserve">is</w:t>
       </w:r>
     </w:p>
     <w:p>
@@ -1216,137 +3676,34 @@
         <w:pStyle w:val="BodyText"/>
       </w:pPr>
     </w:p>
-    <w:bookmarkEnd w:id="31"/>
-    <w:bookmarkStart w:id="34" w:name="update-for-beta"/>
     <w:p>
       <w:pPr>
-        <w:pStyle w:val="Heading2"/>
-      </w:pPr>
-      <w:r>
-        <w:t xml:space="preserve">Update for</w:t>
-      </w:r>
-      <w:r>
-        <w:t xml:space="preserve"> </w:t>
-      </w:r>
-      <m:oMath>
-        <m:r>
-          <m:t>β</m:t>
-        </m:r>
-      </m:oMath>
+        <w:pStyle w:val="BodyText"/>
+      </w:pPr>
+      <w:r>
+        <w:t xml:space="preserve">where describe wtilde and ztilde</w:t>
+      </w:r>
     </w:p>
     <w:p>
       <w:pPr>
-        <w:pStyle w:val="FirstParagraph"/>
-      </w:pPr>
-      <w:r>
-        <w:t xml:space="preserve">To get the update for</w:t>
-      </w:r>
-      <w:r>
-        <w:t xml:space="preserve"> </w:t>
-      </w:r>
-      <m:oMath>
-        <m:r>
-          <m:t>β</m:t>
-        </m:r>
-      </m:oMath>
-      <w:r>
-        <w:t xml:space="preserve"> </w:t>
-      </w:r>
-      <w:r>
-        <w:t xml:space="preserve">we take</w:t>
+        <w:pStyle w:val="BodyText"/>
+      </w:pPr>
+      <w:r>
+        <w:t xml:space="preserve">To train and validate our model we used seven publicly available PDAC datasets. RNAseq datasets were in TPM units. Each dataset was log2 + 1 transformed for variance stabilization. Additionally each dataset was rank transformed to mitigate scale differences between datasets and platforms.</w:t>
+      </w:r>
+      <w:r>
+        <w:t xml:space="preserve"> </w:t>
+      </w:r>
+      <w:r>
+        <w:t xml:space="preserve">For each include sample size, citation, platform</w:t>
       </w:r>
     </w:p>
     <w:p>
       <w:pPr>
         <w:pStyle w:val="BodyText"/>
       </w:pPr>
-    </w:p>
-    <w:p>
-      <w:pPr>
-        <w:pStyle w:val="BodyText"/>
-      </w:pPr>
-      <w:r>
-        <w:t xml:space="preserve">which is equivalent to</w:t>
-      </w:r>
-    </w:p>
-    <w:p>
-      <w:pPr>
-        <w:pStyle w:val="BodyText"/>
-      </w:pPr>
-    </w:p>
-    <w:p>
-      <w:pPr>
-        <w:pStyle w:val="BodyText"/>
-      </w:pPr>
-      <w:r>
-        <w:t xml:space="preserve">Note that this is the same form as a standard cox partial likelihood update. So the</w:t>
-      </w:r>
-      <w:r>
-        <w:t xml:space="preserve"> </w:t>
-      </w:r>
-      <m:oMath>
-        <m:r>
-          <m:t>β</m:t>
-        </m:r>
-      </m:oMath>
-      <w:r>
-        <w:t xml:space="preserve"> </w:t>
-      </w:r>
-      <w:r>
-        <w:t xml:space="preserve">update as derived in</w:t>
-      </w:r>
-      <w:r>
-        <w:t xml:space="preserve"> </w:t>
-      </w:r>
-      <w:r>
-        <w:t xml:space="preserve"> </w:t>
-      </w:r>
-      <w:r>
-        <w:t xml:space="preserve">is</w:t>
-      </w:r>
-    </w:p>
-    <w:p>
-      <w:pPr>
-        <w:pStyle w:val="BodyText"/>
-      </w:pPr>
-    </w:p>
-    <w:p>
-      <w:pPr>
-        <w:pStyle w:val="BodyText"/>
-      </w:pPr>
-      <w:r>
-        <w:t xml:space="preserve">where</w:t>
-      </w:r>
-    </w:p>
-    <w:p>
-      <w:pPr>
-        <w:pStyle w:val="BodyText"/>
-      </w:pPr>
-    </w:p>
-    <w:p>
-      <w:pPr>
-        <w:pStyle w:val="BodyText"/>
-      </w:pPr>
-    </w:p>
-    <w:p>
-      <w:pPr>
-        <w:pStyle w:val="BodyText"/>
-      </w:pPr>
-    </w:p>
-    <w:p>
-      <w:pPr>
-        <w:pStyle w:val="BodyText"/>
-      </w:pPr>
-      <w:r>
-        <w:t xml:space="preserve">Text</w:t>
-      </w:r>
-    </w:p>
-    <w:p>
-      <w:pPr>
-        <w:pStyle w:val="BodyText"/>
-      </w:pPr>
-      <w:r>
-        <w:t xml:space="preserve">DeSurv was applied to the TCGA dataset. The data were log-transformed for variance stabilization and then quantile normalized to ensure comparability of expression values across samples. Next, the data was filtered to the top 5000 highly expressed and variable genes. Models were trained across a grid of hyperparameters</w:t>
+      <w:r>
+        <w:t xml:space="preserve">The TCGA dataset was used for model training. The data was filtered to the top 1000 highly expressed and variable genes. Models were trained across a grid of hyperparameters</w:t>
       </w:r>
       <w:r>
         <w:t xml:space="preserve"> </w:t>
@@ -1592,18 +3949,7 @@
         <w:pStyle w:val="BodyText"/>
       </w:pPr>
       <w:r>
-        <w:t xml:space="preserve">The top genes were extracted from each factor of W in the selected model at each value of</w:t>
-      </w:r>
-      <w:r>
-        <w:t xml:space="preserve"> </w:t>
-      </w:r>
-      <m:oMath>
-        <m:r>
-          <m:t>k</m:t>
-        </m:r>
-      </m:oMath>
-      <w:r>
-        <w:t xml:space="preserve">. A top gene was defined as …</w:t>
+        <w:t xml:space="preserve">Cross-validation was used to select the optimal hyperparameters. To account for lack of uniqueness of NMF solutions, we used 50 random initializations of W,H, and beta per fold. Validation metrics were averaged across fold and initialization.</w:t>
       </w:r>
     </w:p>
     <w:p>
@@ -1611,7 +3957,7 @@
         <w:pStyle w:val="BodyText"/>
       </w:pPr>
       <w:r>
-        <w:t xml:space="preserve">The remaining 7 publicly available datasets, CPTAC, Dijk, Linehan, Moffitt, PACA microarray, PACA RNAseq, and Puleo, were used to validate our models. The datasets were log transformed and merged. To mitigate between study and between platform heterogeneities, the samples were rank transformed. For each selected model, the merged data was restricted to the top genes in each factor and clustered to determine patient subtypes.</w:t>
+        <w:t xml:space="preserve">The remaining 7 publicly available PDAC datasets, CPTAC, Dijk, Linehan, Moffitt, PACA microarray, PACA RNAseq, and Puleo, were used to validate our models. The datasets were restricted to the same highly variable genes in the TCGA dataset, and the fitted model was applied to each dataset individually. The partial likelihood and c-index were calculated for each dataset. Hazard ratios were reported for each factor.</w:t>
       </w:r>
     </w:p>
     <w:p>
@@ -1619,55 +3965,7 @@
         <w:pStyle w:val="BodyText"/>
       </w:pPr>
       <w:r>
-        <w:t xml:space="preserve">Consensus clustering was performed with the ConsensusClusterPlus package in R, using the Kmeans algorithm and euclidean distance. Each repetition samples 80% of subjects and 80% of the top genes. To account for the difference in sample size across studies, subjects were sampled with weight $1/Dn_d $ where</w:t>
-      </w:r>
-      <w:r>
-        <w:t xml:space="preserve"> </w:t>
-      </w:r>
-      <m:oMath>
-        <m:r>
-          <m:t>D</m:t>
-        </m:r>
-      </m:oMath>
-      <w:r>
-        <w:t xml:space="preserve"> </w:t>
-      </w:r>
-      <w:r>
-        <w:t xml:space="preserve">is the number of studies in the validation set, and</w:t>
-      </w:r>
-      <w:r>
-        <w:t xml:space="preserve"> </w:t>
-      </w:r>
-      <m:oMath>
-        <m:sSub>
-          <m:e>
-            <m:r>
-              <m:t>n</m:t>
-            </m:r>
-          </m:e>
-          <m:sub>
-            <m:r>
-              <m:t>d</m:t>
-            </m:r>
-          </m:sub>
-        </m:sSub>
-      </m:oMath>
-      <w:r>
-        <w:t xml:space="preserve"> </w:t>
-      </w:r>
-      <w:r>
-        <w:t xml:space="preserve">is the number of subjects in dataset</w:t>
-      </w:r>
-      <w:r>
-        <w:t xml:space="preserve"> </w:t>
-      </w:r>
-      <m:oMath>
-        <m:r>
-          <m:t>d</m:t>
-        </m:r>
-      </m:oMath>
-      <w:r>
-        <w:t xml:space="preserve">. The number of clusters ranged from 2-3.</w:t>
+        <w:t xml:space="preserve">In a clinical setting, it may not be feasible to sequence all of the genes required to port the full W matrix to future test sets. For this purpose we also propose a score based method, where only the identity of top genes for each factor must be ported to future datasets. To construct the scores we define Wtilde as a binary matrix… To predict patient outcomes in future datasets, we restrict those datasets to these g x k genes, and compute XtWtilde as linear predictor in the survival model.</w:t>
       </w:r>
     </w:p>
     <w:p>
@@ -1675,48 +3973,23 @@
         <w:pStyle w:val="BodyText"/>
       </w:pPr>
       <w:r>
-        <w:t xml:space="preserve">After clustering, stratified cox models were fit to the clusters in the merged validation dataset. From these models, the following metrics were obtained: the hazard ratio, c-index, BIC, and p-values for the likelihood ratio test. These metrics were used to compare our approach to the unsupervised NMF equivalent.</w:t>
+        <w:t xml:space="preserve">The top genes were extracted from each factor of W in the selected model at each value of</w:t>
+      </w:r>
+      <w:r>
+        <w:t xml:space="preserve"> </w:t>
+      </w:r>
+      <m:oMath>
+        <m:r>
+          <m:t>k</m:t>
+        </m:r>
+      </m:oMath>
+      <w:r>
+        <w:t xml:space="preserve">. A top gene was defined as …</w:t>
       </w:r>
     </w:p>
-    <w:bookmarkStart w:id="33" w:name="refs"/>
-    <w:bookmarkStart w:id="32" w:name="ref-lee2000algorithms"/>
-    <w:p>
-      <w:pPr>
-        <w:pStyle w:val="Bibliography"/>
-      </w:pPr>
-      <w:r>
-        <w:t xml:space="preserve">1.</w:t>
-      </w:r>
-      <w:r>
-        <w:t xml:space="preserve"> </w:t>
-      </w:r>
-      <w:r>
-        <w:t xml:space="preserve">	</w:t>
-      </w:r>
-      <w:r>
-        <w:t xml:space="preserve">Lee D, Seung HS (2000) Algorithms for non-negative matrix factorization.</w:t>
-      </w:r>
-      <w:r>
-        <w:t xml:space="preserve"> </w:t>
-      </w:r>
-      <w:r>
-        <w:rPr>
-          <w:i/>
-          <w:iCs/>
-        </w:rPr>
-        <w:t xml:space="preserve">Advances in neural information processing systems</w:t>
-      </w:r>
-      <w:r>
-        <w:t xml:space="preserve"> </w:t>
-      </w:r>
-      <w:r>
-        <w:t xml:space="preserve">13.</w:t>
-      </w:r>
-    </w:p>
-    <w:bookmarkEnd w:id="32"/>
-    <w:bookmarkEnd w:id="33"/>
-    <w:bookmarkEnd w:id="34"/>
-    <w:bookmarkEnd w:id="35"/>
+    <w:bookmarkEnd w:id="36"/>
+    <w:bookmarkEnd w:id="37"/>
+    <w:bookmarkEnd w:id="38"/>
     <w:sectPr/>
   </w:body>
 </w:document>

</xml_diff>